<commit_message>
Reportes ICILS y PISA terminados
</commit_message>
<xml_diff>
--- a/output/figures/tables/invariance_table_icils.docx
+++ b/output/figures/tables/invariance_table_icils.docx
@@ -17,23 +17,23 @@
         <w:tblLook w:firstRow="1" w:lastRow="0" w:firstColumn="0" w:lastColumn="0" w:noHBand="0" w:noVBand="1"/>
       </w:tblPr>
       <w:tblGrid>
-        <w:gridCol w:w="761"/>
-        <w:gridCol w:w="1124"/>
-        <w:gridCol w:w="660"/>
-        <w:gridCol w:w="569"/>
-        <w:gridCol w:w="569"/>
-        <w:gridCol w:w="569"/>
-        <w:gridCol w:w="773"/>
-        <w:gridCol w:w="660"/>
-        <w:gridCol w:w="462"/>
-        <w:gridCol w:w="754"/>
-        <w:gridCol w:w="891"/>
-        <w:gridCol w:w="611"/>
-        <w:gridCol w:w="921"/>
+        <w:gridCol w:w="684"/>
+        <w:gridCol w:w="1013"/>
+        <w:gridCol w:w="600"/>
+        <w:gridCol w:w="520"/>
+        <w:gridCol w:w="520"/>
+        <w:gridCol w:w="520"/>
+        <w:gridCol w:w="810"/>
+        <w:gridCol w:w="600"/>
+        <w:gridCol w:w="433"/>
+        <w:gridCol w:w="704"/>
+        <w:gridCol w:w="923"/>
+        <w:gridCol w:w="570"/>
+        <w:gridCol w:w="810"/>
       </w:tblGrid>
       <w:tr>
         <w:trPr>
-          <w:trHeight w:val="357" w:hRule="auto"/>
+          <w:trHeight w:val="320" w:hRule="auto"/>
           <w:tblHeader/>
         </w:trPr>
         header1
@@ -66,7 +66,7 @@
               <w:spacing w:after="60" w:before="60" w:line="240"/>
               <w:ind w:left="60" w:right="60" w:firstLine="0" w:firstLineChars="0"/>
               <w:rPr>
-                <w:rFonts w:ascii="Calibri" w:hAnsi="Calibri" w:eastAsia="Calibri" w:cs="Calibri"/>
+                <w:rFonts w:ascii="Times New Roman" w:hAnsi="Times New Roman" w:eastAsia="Times New Roman" w:cs="Times New Roman"/>
                 <w:i w:val="false"/>
                 <w:b w:val="true"/>
                 <w:u w:val="none"/>
@@ -78,7 +78,7 @@
             </w:pPr>
             <w:r>
               <w:rPr>
-                <w:rFonts w:ascii="Calibri" w:hAnsi="Calibri" w:eastAsia="Calibri" w:cs="Calibri"/>
+                <w:rFonts w:ascii="Times New Roman" w:hAnsi="Times New Roman" w:eastAsia="Times New Roman" w:cs="Times New Roman"/>
                 <w:i w:val="false"/>
                 <w:b w:val="true"/>
                 <w:u w:val="none"/>
@@ -120,7 +120,7 @@
               <w:spacing w:after="60" w:before="60" w:line="240"/>
               <w:ind w:left="60" w:right="60" w:firstLine="0" w:firstLineChars="0"/>
               <w:rPr>
-                <w:rFonts w:ascii="Calibri" w:hAnsi="Calibri" w:eastAsia="Calibri" w:cs="Calibri"/>
+                <w:rFonts w:ascii="Times New Roman" w:hAnsi="Times New Roman" w:eastAsia="Times New Roman" w:cs="Times New Roman"/>
                 <w:i w:val="false"/>
                 <w:b w:val="true"/>
                 <w:u w:val="none"/>
@@ -132,7 +132,7 @@
             </w:pPr>
             <w:r>
               <w:rPr>
-                <w:rFonts w:ascii="Calibri" w:hAnsi="Calibri" w:eastAsia="Calibri" w:cs="Calibri"/>
+                <w:rFonts w:ascii="Times New Roman" w:hAnsi="Times New Roman" w:eastAsia="Times New Roman" w:cs="Times New Roman"/>
                 <w:i w:val="false"/>
                 <w:b w:val="true"/>
                 <w:u w:val="none"/>
@@ -174,7 +174,7 @@
               <w:spacing w:after="60" w:before="60" w:line="240"/>
               <w:ind w:left="60" w:right="60" w:firstLine="0" w:firstLineChars="0"/>
               <w:rPr>
-                <w:rFonts w:ascii="Calibri" w:hAnsi="Calibri" w:eastAsia="Calibri" w:cs="Calibri"/>
+                <w:rFonts w:ascii="Times New Roman" w:hAnsi="Times New Roman" w:eastAsia="Times New Roman" w:cs="Times New Roman"/>
                 <w:i w:val="false"/>
                 <w:b w:val="true"/>
                 <w:u w:val="none"/>
@@ -186,7 +186,7 @@
             </w:pPr>
             <w:r>
               <w:rPr>
-                <w:rFonts w:ascii="Calibri" w:hAnsi="Calibri" w:eastAsia="Calibri" w:cs="Calibri"/>
+                <w:rFonts w:ascii="Times New Roman" w:hAnsi="Times New Roman" w:eastAsia="Times New Roman" w:cs="Times New Roman"/>
                 <w:i w:val="false"/>
                 <w:b w:val="true"/>
                 <w:u w:val="none"/>
@@ -228,7 +228,7 @@
               <w:spacing w:after="60" w:before="60" w:line="240"/>
               <w:ind w:left="60" w:right="60" w:firstLine="0" w:firstLineChars="0"/>
               <w:rPr>
-                <w:rFonts w:ascii="Calibri" w:hAnsi="Calibri" w:eastAsia="Calibri" w:cs="Calibri"/>
+                <w:rFonts w:ascii="Times New Roman" w:hAnsi="Times New Roman" w:eastAsia="Times New Roman" w:cs="Times New Roman"/>
                 <w:i w:val="false"/>
                 <w:b w:val="true"/>
                 <w:u w:val="none"/>
@@ -240,7 +240,7 @@
             </w:pPr>
             <w:r>
               <w:rPr>
-                <w:rFonts w:ascii="Calibri" w:hAnsi="Calibri" w:eastAsia="Calibri" w:cs="Calibri"/>
+                <w:rFonts w:ascii="Times New Roman" w:hAnsi="Times New Roman" w:eastAsia="Times New Roman" w:cs="Times New Roman"/>
                 <w:i w:val="false"/>
                 <w:b w:val="true"/>
                 <w:u w:val="none"/>
@@ -282,7 +282,7 @@
               <w:spacing w:after="60" w:before="60" w:line="240"/>
               <w:ind w:left="60" w:right="60" w:firstLine="0" w:firstLineChars="0"/>
               <w:rPr>
-                <w:rFonts w:ascii="Calibri" w:hAnsi="Calibri" w:eastAsia="Calibri" w:cs="Calibri"/>
+                <w:rFonts w:ascii="Times New Roman" w:hAnsi="Times New Roman" w:eastAsia="Times New Roman" w:cs="Times New Roman"/>
                 <w:i w:val="false"/>
                 <w:b w:val="true"/>
                 <w:u w:val="none"/>
@@ -294,7 +294,7 @@
             </w:pPr>
             <w:r>
               <w:rPr>
-                <w:rFonts w:ascii="Calibri" w:hAnsi="Calibri" w:eastAsia="Calibri" w:cs="Calibri"/>
+                <w:rFonts w:ascii="Times New Roman" w:hAnsi="Times New Roman" w:eastAsia="Times New Roman" w:cs="Times New Roman"/>
                 <w:i w:val="false"/>
                 <w:b w:val="true"/>
                 <w:u w:val="none"/>
@@ -336,7 +336,7 @@
               <w:spacing w:after="60" w:before="60" w:line="240"/>
               <w:ind w:left="60" w:right="60" w:firstLine="0" w:firstLineChars="0"/>
               <w:rPr>
-                <w:rFonts w:ascii="Calibri" w:hAnsi="Calibri" w:eastAsia="Calibri" w:cs="Calibri"/>
+                <w:rFonts w:ascii="Times New Roman" w:hAnsi="Times New Roman" w:eastAsia="Times New Roman" w:cs="Times New Roman"/>
                 <w:i w:val="false"/>
                 <w:b w:val="true"/>
                 <w:u w:val="none"/>
@@ -348,7 +348,7 @@
             </w:pPr>
             <w:r>
               <w:rPr>
-                <w:rFonts w:ascii="Calibri" w:hAnsi="Calibri" w:eastAsia="Calibri" w:cs="Calibri"/>
+                <w:rFonts w:ascii="Times New Roman" w:hAnsi="Times New Roman" w:eastAsia="Times New Roman" w:cs="Times New Roman"/>
                 <w:i w:val="false"/>
                 <w:b w:val="true"/>
                 <w:u w:val="none"/>
@@ -390,7 +390,7 @@
               <w:spacing w:after="60" w:before="60" w:line="240"/>
               <w:ind w:left="60" w:right="60" w:firstLine="0" w:firstLineChars="0"/>
               <w:rPr>
-                <w:rFonts w:ascii="Calibri" w:hAnsi="Calibri" w:eastAsia="Calibri" w:cs="Calibri"/>
+                <w:rFonts w:ascii="Times New Roman" w:hAnsi="Times New Roman" w:eastAsia="Times New Roman" w:cs="Times New Roman"/>
                 <w:i w:val="false"/>
                 <w:b w:val="true"/>
                 <w:u w:val="none"/>
@@ -402,7 +402,7 @@
             </w:pPr>
             <w:r>
               <w:rPr>
-                <w:rFonts w:ascii="Calibri" w:hAnsi="Calibri" w:eastAsia="Calibri" w:cs="Calibri"/>
+                <w:rFonts w:ascii="Times New Roman" w:hAnsi="Times New Roman" w:eastAsia="Times New Roman" w:cs="Times New Roman"/>
                 <w:i w:val="false"/>
                 <w:b w:val="true"/>
                 <w:u w:val="none"/>
@@ -444,7 +444,7 @@
               <w:spacing w:after="60" w:before="60" w:line="240"/>
               <w:ind w:left="60" w:right="60" w:firstLine="0" w:firstLineChars="0"/>
               <w:rPr>
-                <w:rFonts w:ascii="Calibri" w:hAnsi="Calibri" w:eastAsia="Calibri" w:cs="Calibri"/>
+                <w:rFonts w:ascii="Times New Roman" w:hAnsi="Times New Roman" w:eastAsia="Times New Roman" w:cs="Times New Roman"/>
                 <w:i w:val="false"/>
                 <w:b w:val="true"/>
                 <w:u w:val="none"/>
@@ -456,7 +456,7 @@
             </w:pPr>
             <w:r>
               <w:rPr>
-                <w:rFonts w:ascii="Calibri" w:hAnsi="Calibri" w:eastAsia="Calibri" w:cs="Calibri"/>
+                <w:rFonts w:ascii="Times New Roman" w:hAnsi="Times New Roman" w:eastAsia="Times New Roman" w:cs="Times New Roman"/>
                 <w:i w:val="false"/>
                 <w:b w:val="true"/>
                 <w:u w:val="none"/>
@@ -498,7 +498,7 @@
               <w:spacing w:after="60" w:before="60" w:line="240"/>
               <w:ind w:left="60" w:right="60" w:firstLine="0" w:firstLineChars="0"/>
               <w:rPr>
-                <w:rFonts w:ascii="Calibri" w:hAnsi="Calibri" w:eastAsia="Calibri" w:cs="Calibri"/>
+                <w:rFonts w:ascii="Times New Roman" w:hAnsi="Times New Roman" w:eastAsia="Times New Roman" w:cs="Times New Roman"/>
                 <w:i w:val="false"/>
                 <w:b w:val="true"/>
                 <w:u w:val="none"/>
@@ -510,7 +510,7 @@
             </w:pPr>
             <w:r>
               <w:rPr>
-                <w:rFonts w:ascii="Calibri" w:hAnsi="Calibri" w:eastAsia="Calibri" w:cs="Calibri"/>
+                <w:rFonts w:ascii="Times New Roman" w:hAnsi="Times New Roman" w:eastAsia="Times New Roman" w:cs="Times New Roman"/>
                 <w:i w:val="false"/>
                 <w:b w:val="true"/>
                 <w:u w:val="none"/>
@@ -552,7 +552,7 @@
               <w:spacing w:after="60" w:before="60" w:line="240"/>
               <w:ind w:left="60" w:right="60" w:firstLine="0" w:firstLineChars="0"/>
               <w:rPr>
-                <w:rFonts w:ascii="Calibri" w:hAnsi="Calibri" w:eastAsia="Calibri" w:cs="Calibri"/>
+                <w:rFonts w:ascii="Times New Roman" w:hAnsi="Times New Roman" w:eastAsia="Times New Roman" w:cs="Times New Roman"/>
                 <w:i w:val="false"/>
                 <w:b w:val="true"/>
                 <w:u w:val="none"/>
@@ -564,7 +564,7 @@
             </w:pPr>
             <w:r>
               <w:rPr>
-                <w:rFonts w:ascii="Calibri" w:hAnsi="Calibri" w:eastAsia="Calibri" w:cs="Calibri"/>
+                <w:rFonts w:ascii="Times New Roman" w:hAnsi="Times New Roman" w:eastAsia="Times New Roman" w:cs="Times New Roman"/>
                 <w:i w:val="false"/>
                 <w:b w:val="true"/>
                 <w:u w:val="none"/>
@@ -606,7 +606,7 @@
               <w:spacing w:after="60" w:before="60" w:line="240"/>
               <w:ind w:left="60" w:right="60" w:firstLine="0" w:firstLineChars="0"/>
               <w:rPr>
-                <w:rFonts w:ascii="Calibri" w:hAnsi="Calibri" w:eastAsia="Calibri" w:cs="Calibri"/>
+                <w:rFonts w:ascii="Times New Roman" w:hAnsi="Times New Roman" w:eastAsia="Times New Roman" w:cs="Times New Roman"/>
                 <w:i w:val="false"/>
                 <w:b w:val="true"/>
                 <w:u w:val="none"/>
@@ -618,7 +618,7 @@
             </w:pPr>
             <w:r>
               <w:rPr>
-                <w:rFonts w:ascii="Calibri" w:hAnsi="Calibri" w:eastAsia="Calibri" w:cs="Calibri"/>
+                <w:rFonts w:ascii="Times New Roman" w:hAnsi="Times New Roman" w:eastAsia="Times New Roman" w:cs="Times New Roman"/>
                 <w:i w:val="false"/>
                 <w:b w:val="true"/>
                 <w:u w:val="none"/>
@@ -660,7 +660,7 @@
               <w:spacing w:after="60" w:before="60" w:line="240"/>
               <w:ind w:left="60" w:right="60" w:firstLine="0" w:firstLineChars="0"/>
               <w:rPr>
-                <w:rFonts w:ascii="Calibri" w:hAnsi="Calibri" w:eastAsia="Calibri" w:cs="Calibri"/>
+                <w:rFonts w:ascii="Times New Roman" w:hAnsi="Times New Roman" w:eastAsia="Times New Roman" w:cs="Times New Roman"/>
                 <w:i w:val="false"/>
                 <w:b w:val="true"/>
                 <w:u w:val="none"/>
@@ -672,7 +672,7 @@
             </w:pPr>
             <w:r>
               <w:rPr>
-                <w:rFonts w:ascii="Calibri" w:hAnsi="Calibri" w:eastAsia="Calibri" w:cs="Calibri"/>
+                <w:rFonts w:ascii="Times New Roman" w:hAnsi="Times New Roman" w:eastAsia="Times New Roman" w:cs="Times New Roman"/>
                 <w:i w:val="false"/>
                 <w:b w:val="true"/>
                 <w:u w:val="none"/>
@@ -714,7 +714,7 @@
               <w:spacing w:after="60" w:before="60" w:line="240"/>
               <w:ind w:left="60" w:right="60" w:firstLine="0" w:firstLineChars="0"/>
               <w:rPr>
-                <w:rFonts w:ascii="Calibri" w:hAnsi="Calibri" w:eastAsia="Calibri" w:cs="Calibri"/>
+                <w:rFonts w:ascii="Times New Roman" w:hAnsi="Times New Roman" w:eastAsia="Times New Roman" w:cs="Times New Roman"/>
                 <w:i w:val="false"/>
                 <w:b w:val="true"/>
                 <w:u w:val="none"/>
@@ -726,7 +726,7 @@
             </w:pPr>
             <w:r>
               <w:rPr>
-                <w:rFonts w:ascii="Calibri" w:hAnsi="Calibri" w:eastAsia="Calibri" w:cs="Calibri"/>
+                <w:rFonts w:ascii="Times New Roman" w:hAnsi="Times New Roman" w:eastAsia="Times New Roman" w:cs="Times New Roman"/>
                 <w:i w:val="false"/>
                 <w:b w:val="true"/>
                 <w:u w:val="none"/>
@@ -742,7 +742,7 @@
       </w:tr>
       <w:tr>
         <w:trPr>
-          <w:trHeight w:val="321" w:hRule="auto"/>
+          <w:trHeight w:val="306" w:hRule="auto"/>
         </w:trPr>
         body1
         <w:tc>
@@ -774,19 +774,19 @@
               <w:spacing w:after="60" w:before="60" w:line="240"/>
               <w:ind w:left="60" w:right="60" w:firstLine="0" w:firstLineChars="0"/>
               <w:rPr>
-                <w:rFonts w:ascii="Calibri" w:hAnsi="Calibri" w:eastAsia="Calibri" w:cs="Calibri"/>
-                <w:i w:val="false"/>
-                <w:b w:val="false"/>
-                <w:u w:val="none"/>
-                <w:strike w:val="false"/>
-                <w:sz w:val="16"/>
-                <w:szCs w:val="16"/>
-                <w:color w:val="000000"/>
-              </w:rPr>
-            </w:pPr>
-            <w:r>
-              <w:rPr>
-                <w:rFonts w:ascii="Calibri" w:hAnsi="Calibri" w:eastAsia="Calibri" w:cs="Calibri"/>
+                <w:rFonts w:ascii="Times New Roman" w:hAnsi="Times New Roman" w:eastAsia="Times New Roman" w:cs="Times New Roman"/>
+                <w:i w:val="false"/>
+                <w:b w:val="false"/>
+                <w:u w:val="none"/>
+                <w:strike w:val="false"/>
+                <w:sz w:val="16"/>
+                <w:szCs w:val="16"/>
+                <w:color w:val="000000"/>
+              </w:rPr>
+            </w:pPr>
+            <w:r>
+              <w:rPr>
+                <w:rFonts w:ascii="Times New Roman" w:hAnsi="Times New Roman" w:eastAsia="Times New Roman" w:cs="Times New Roman"/>
                 <w:i w:val="false"/>
                 <w:b w:val="false"/>
                 <w:u w:val="none"/>
@@ -828,19 +828,19 @@
               <w:spacing w:after="60" w:before="60" w:line="240"/>
               <w:ind w:left="60" w:right="60" w:firstLine="0" w:firstLineChars="0"/>
               <w:rPr>
-                <w:rFonts w:ascii="Calibri" w:hAnsi="Calibri" w:eastAsia="Calibri" w:cs="Calibri"/>
-                <w:i w:val="false"/>
-                <w:b w:val="false"/>
-                <w:u w:val="none"/>
-                <w:strike w:val="false"/>
-                <w:sz w:val="16"/>
-                <w:szCs w:val="16"/>
-                <w:color w:val="000000"/>
-              </w:rPr>
-            </w:pPr>
-            <w:r>
-              <w:rPr>
-                <w:rFonts w:ascii="Calibri" w:hAnsi="Calibri" w:eastAsia="Calibri" w:cs="Calibri"/>
+                <w:rFonts w:ascii="Times New Roman" w:hAnsi="Times New Roman" w:eastAsia="Times New Roman" w:cs="Times New Roman"/>
+                <w:i w:val="false"/>
+                <w:b w:val="false"/>
+                <w:u w:val="none"/>
+                <w:strike w:val="false"/>
+                <w:sz w:val="16"/>
+                <w:szCs w:val="16"/>
+                <w:color w:val="000000"/>
+              </w:rPr>
+            </w:pPr>
+            <w:r>
+              <w:rPr>
+                <w:rFonts w:ascii="Times New Roman" w:hAnsi="Times New Roman" w:eastAsia="Times New Roman" w:cs="Times New Roman"/>
                 <w:i w:val="false"/>
                 <w:b w:val="false"/>
                 <w:u w:val="none"/>
@@ -882,19 +882,19 @@
               <w:spacing w:after="60" w:before="60" w:line="240"/>
               <w:ind w:left="60" w:right="60" w:firstLine="0" w:firstLineChars="0"/>
               <w:rPr>
-                <w:rFonts w:ascii="Calibri" w:hAnsi="Calibri" w:eastAsia="Calibri" w:cs="Calibri"/>
-                <w:i w:val="false"/>
-                <w:b w:val="false"/>
-                <w:u w:val="none"/>
-                <w:strike w:val="false"/>
-                <w:sz w:val="16"/>
-                <w:szCs w:val="16"/>
-                <w:color w:val="000000"/>
-              </w:rPr>
-            </w:pPr>
-            <w:r>
-              <w:rPr>
-                <w:rFonts w:ascii="Calibri" w:hAnsi="Calibri" w:eastAsia="Calibri" w:cs="Calibri"/>
+                <w:rFonts w:ascii="Times New Roman" w:hAnsi="Times New Roman" w:eastAsia="Times New Roman" w:cs="Times New Roman"/>
+                <w:i w:val="false"/>
+                <w:b w:val="false"/>
+                <w:u w:val="none"/>
+                <w:strike w:val="false"/>
+                <w:sz w:val="16"/>
+                <w:szCs w:val="16"/>
+                <w:color w:val="000000"/>
+              </w:rPr>
+            </w:pPr>
+            <w:r>
+              <w:rPr>
+                <w:rFonts w:ascii="Times New Roman" w:hAnsi="Times New Roman" w:eastAsia="Times New Roman" w:cs="Times New Roman"/>
                 <w:i w:val="false"/>
                 <w:b w:val="false"/>
                 <w:u w:val="none"/>
@@ -936,19 +936,19 @@
               <w:spacing w:after="60" w:before="60" w:line="240"/>
               <w:ind w:left="60" w:right="60" w:firstLine="0" w:firstLineChars="0"/>
               <w:rPr>
-                <w:rFonts w:ascii="Calibri" w:hAnsi="Calibri" w:eastAsia="Calibri" w:cs="Calibri"/>
-                <w:i w:val="false"/>
-                <w:b w:val="false"/>
-                <w:u w:val="none"/>
-                <w:strike w:val="false"/>
-                <w:sz w:val="16"/>
-                <w:szCs w:val="16"/>
-                <w:color w:val="000000"/>
-              </w:rPr>
-            </w:pPr>
-            <w:r>
-              <w:rPr>
-                <w:rFonts w:ascii="Calibri" w:hAnsi="Calibri" w:eastAsia="Calibri" w:cs="Calibri"/>
+                <w:rFonts w:ascii="Times New Roman" w:hAnsi="Times New Roman" w:eastAsia="Times New Roman" w:cs="Times New Roman"/>
+                <w:i w:val="false"/>
+                <w:b w:val="false"/>
+                <w:u w:val="none"/>
+                <w:strike w:val="false"/>
+                <w:sz w:val="16"/>
+                <w:szCs w:val="16"/>
+                <w:color w:val="000000"/>
+              </w:rPr>
+            </w:pPr>
+            <w:r>
+              <w:rPr>
+                <w:rFonts w:ascii="Times New Roman" w:hAnsi="Times New Roman" w:eastAsia="Times New Roman" w:cs="Times New Roman"/>
                 <w:i w:val="false"/>
                 <w:b w:val="false"/>
                 <w:u w:val="none"/>
@@ -990,19 +990,19 @@
               <w:spacing w:after="60" w:before="60" w:line="240"/>
               <w:ind w:left="60" w:right="60" w:firstLine="0" w:firstLineChars="0"/>
               <w:rPr>
-                <w:rFonts w:ascii="Calibri" w:hAnsi="Calibri" w:eastAsia="Calibri" w:cs="Calibri"/>
-                <w:i w:val="false"/>
-                <w:b w:val="false"/>
-                <w:u w:val="none"/>
-                <w:strike w:val="false"/>
-                <w:sz w:val="16"/>
-                <w:szCs w:val="16"/>
-                <w:color w:val="000000"/>
-              </w:rPr>
-            </w:pPr>
-            <w:r>
-              <w:rPr>
-                <w:rFonts w:ascii="Calibri" w:hAnsi="Calibri" w:eastAsia="Calibri" w:cs="Calibri"/>
+                <w:rFonts w:ascii="Times New Roman" w:hAnsi="Times New Roman" w:eastAsia="Times New Roman" w:cs="Times New Roman"/>
+                <w:i w:val="false"/>
+                <w:b w:val="false"/>
+                <w:u w:val="none"/>
+                <w:strike w:val="false"/>
+                <w:sz w:val="16"/>
+                <w:szCs w:val="16"/>
+                <w:color w:val="000000"/>
+              </w:rPr>
+            </w:pPr>
+            <w:r>
+              <w:rPr>
+                <w:rFonts w:ascii="Times New Roman" w:hAnsi="Times New Roman" w:eastAsia="Times New Roman" w:cs="Times New Roman"/>
                 <w:i w:val="false"/>
                 <w:b w:val="false"/>
                 <w:u w:val="none"/>
@@ -1044,19 +1044,19 @@
               <w:spacing w:after="60" w:before="60" w:line="240"/>
               <w:ind w:left="60" w:right="60" w:firstLine="0" w:firstLineChars="0"/>
               <w:rPr>
-                <w:rFonts w:ascii="Calibri" w:hAnsi="Calibri" w:eastAsia="Calibri" w:cs="Calibri"/>
-                <w:i w:val="false"/>
-                <w:b w:val="false"/>
-                <w:u w:val="none"/>
-                <w:strike w:val="false"/>
-                <w:sz w:val="16"/>
-                <w:szCs w:val="16"/>
-                <w:color w:val="000000"/>
-              </w:rPr>
-            </w:pPr>
-            <w:r>
-              <w:rPr>
-                <w:rFonts w:ascii="Calibri" w:hAnsi="Calibri" w:eastAsia="Calibri" w:cs="Calibri"/>
+                <w:rFonts w:ascii="Times New Roman" w:hAnsi="Times New Roman" w:eastAsia="Times New Roman" w:cs="Times New Roman"/>
+                <w:i w:val="false"/>
+                <w:b w:val="false"/>
+                <w:u w:val="none"/>
+                <w:strike w:val="false"/>
+                <w:sz w:val="16"/>
+                <w:szCs w:val="16"/>
+                <w:color w:val="000000"/>
+              </w:rPr>
+            </w:pPr>
+            <w:r>
+              <w:rPr>
+                <w:rFonts w:ascii="Times New Roman" w:hAnsi="Times New Roman" w:eastAsia="Times New Roman" w:cs="Times New Roman"/>
                 <w:i w:val="false"/>
                 <w:b w:val="false"/>
                 <w:u w:val="none"/>
@@ -1098,19 +1098,19 @@
               <w:spacing w:after="60" w:before="60" w:line="240"/>
               <w:ind w:left="60" w:right="60" w:firstLine="0" w:firstLineChars="0"/>
               <w:rPr>
-                <w:rFonts w:ascii="Calibri" w:hAnsi="Calibri" w:eastAsia="Calibri" w:cs="Calibri"/>
-                <w:i w:val="false"/>
-                <w:b w:val="false"/>
-                <w:u w:val="none"/>
-                <w:strike w:val="false"/>
-                <w:sz w:val="16"/>
-                <w:szCs w:val="16"/>
-                <w:color w:val="000000"/>
-              </w:rPr>
-            </w:pPr>
-            <w:r>
-              <w:rPr>
-                <w:rFonts w:ascii="Calibri" w:hAnsi="Calibri" w:eastAsia="Calibri" w:cs="Calibri"/>
+                <w:rFonts w:ascii="Times New Roman" w:hAnsi="Times New Roman" w:eastAsia="Times New Roman" w:cs="Times New Roman"/>
+                <w:i w:val="false"/>
+                <w:b w:val="false"/>
+                <w:u w:val="none"/>
+                <w:strike w:val="false"/>
+                <w:sz w:val="16"/>
+                <w:szCs w:val="16"/>
+                <w:color w:val="000000"/>
+              </w:rPr>
+            </w:pPr>
+            <w:r>
+              <w:rPr>
+                <w:rFonts w:ascii="Times New Roman" w:hAnsi="Times New Roman" w:eastAsia="Times New Roman" w:cs="Times New Roman"/>
                 <w:i w:val="false"/>
                 <w:b w:val="false"/>
                 <w:u w:val="none"/>
@@ -1152,19 +1152,19 @@
               <w:spacing w:after="60" w:before="60" w:line="240"/>
               <w:ind w:left="60" w:right="60" w:firstLine="0" w:firstLineChars="0"/>
               <w:rPr>
-                <w:rFonts w:ascii="Calibri" w:hAnsi="Calibri" w:eastAsia="Calibri" w:cs="Calibri"/>
-                <w:i w:val="false"/>
-                <w:b w:val="false"/>
-                <w:u w:val="none"/>
-                <w:strike w:val="false"/>
-                <w:sz w:val="16"/>
-                <w:szCs w:val="16"/>
-                <w:color w:val="000000"/>
-              </w:rPr>
-            </w:pPr>
-            <w:r>
-              <w:rPr>
-                <w:rFonts w:ascii="Calibri" w:hAnsi="Calibri" w:eastAsia="Calibri" w:cs="Calibri"/>
+                <w:rFonts w:ascii="Times New Roman" w:hAnsi="Times New Roman" w:eastAsia="Times New Roman" w:cs="Times New Roman"/>
+                <w:i w:val="false"/>
+                <w:b w:val="false"/>
+                <w:u w:val="none"/>
+                <w:strike w:val="false"/>
+                <w:sz w:val="16"/>
+                <w:szCs w:val="16"/>
+                <w:color w:val="000000"/>
+              </w:rPr>
+            </w:pPr>
+            <w:r>
+              <w:rPr>
+                <w:rFonts w:ascii="Times New Roman" w:hAnsi="Times New Roman" w:eastAsia="Times New Roman" w:cs="Times New Roman"/>
                 <w:i w:val="false"/>
                 <w:b w:val="false"/>
                 <w:u w:val="none"/>
@@ -1206,19 +1206,19 @@
               <w:spacing w:after="60" w:before="60" w:line="240"/>
               <w:ind w:left="60" w:right="60" w:firstLine="0" w:firstLineChars="0"/>
               <w:rPr>
-                <w:rFonts w:ascii="Calibri" w:hAnsi="Calibri" w:eastAsia="Calibri" w:cs="Calibri"/>
-                <w:i w:val="false"/>
-                <w:b w:val="false"/>
-                <w:u w:val="none"/>
-                <w:strike w:val="false"/>
-                <w:sz w:val="16"/>
-                <w:szCs w:val="16"/>
-                <w:color w:val="000000"/>
-              </w:rPr>
-            </w:pPr>
-            <w:r>
-              <w:rPr>
-                <w:rFonts w:ascii="Calibri" w:hAnsi="Calibri" w:eastAsia="Calibri" w:cs="Calibri"/>
+                <w:rFonts w:ascii="Times New Roman" w:hAnsi="Times New Roman" w:eastAsia="Times New Roman" w:cs="Times New Roman"/>
+                <w:i w:val="false"/>
+                <w:b w:val="false"/>
+                <w:u w:val="none"/>
+                <w:strike w:val="false"/>
+                <w:sz w:val="16"/>
+                <w:szCs w:val="16"/>
+                <w:color w:val="000000"/>
+              </w:rPr>
+            </w:pPr>
+            <w:r>
+              <w:rPr>
+                <w:rFonts w:ascii="Times New Roman" w:hAnsi="Times New Roman" w:eastAsia="Times New Roman" w:cs="Times New Roman"/>
                 <w:i w:val="false"/>
                 <w:b w:val="false"/>
                 <w:u w:val="none"/>
@@ -1260,19 +1260,19 @@
               <w:spacing w:after="60" w:before="60" w:line="240"/>
               <w:ind w:left="60" w:right="60" w:firstLine="0" w:firstLineChars="0"/>
               <w:rPr>
-                <w:rFonts w:ascii="Calibri" w:hAnsi="Calibri" w:eastAsia="Calibri" w:cs="Calibri"/>
-                <w:i w:val="false"/>
-                <w:b w:val="false"/>
-                <w:u w:val="none"/>
-                <w:strike w:val="false"/>
-                <w:sz w:val="16"/>
-                <w:szCs w:val="16"/>
-                <w:color w:val="000000"/>
-              </w:rPr>
-            </w:pPr>
-            <w:r>
-              <w:rPr>
-                <w:rFonts w:ascii="Calibri" w:hAnsi="Calibri" w:eastAsia="Calibri" w:cs="Calibri"/>
+                <w:rFonts w:ascii="Times New Roman" w:hAnsi="Times New Roman" w:eastAsia="Times New Roman" w:cs="Times New Roman"/>
+                <w:i w:val="false"/>
+                <w:b w:val="false"/>
+                <w:u w:val="none"/>
+                <w:strike w:val="false"/>
+                <w:sz w:val="16"/>
+                <w:szCs w:val="16"/>
+                <w:color w:val="000000"/>
+              </w:rPr>
+            </w:pPr>
+            <w:r>
+              <w:rPr>
+                <w:rFonts w:ascii="Times New Roman" w:hAnsi="Times New Roman" w:eastAsia="Times New Roman" w:cs="Times New Roman"/>
                 <w:i w:val="false"/>
                 <w:b w:val="false"/>
                 <w:u w:val="none"/>
@@ -1314,19 +1314,19 @@
               <w:spacing w:after="60" w:before="60" w:line="240"/>
               <w:ind w:left="60" w:right="60" w:firstLine="0" w:firstLineChars="0"/>
               <w:rPr>
-                <w:rFonts w:ascii="Calibri" w:hAnsi="Calibri" w:eastAsia="Calibri" w:cs="Calibri"/>
-                <w:i w:val="false"/>
-                <w:b w:val="false"/>
-                <w:u w:val="none"/>
-                <w:strike w:val="false"/>
-                <w:sz w:val="16"/>
-                <w:szCs w:val="16"/>
-                <w:color w:val="000000"/>
-              </w:rPr>
-            </w:pPr>
-            <w:r>
-              <w:rPr>
-                <w:rFonts w:ascii="Calibri" w:hAnsi="Calibri" w:eastAsia="Calibri" w:cs="Calibri"/>
+                <w:rFonts w:ascii="Times New Roman" w:hAnsi="Times New Roman" w:eastAsia="Times New Roman" w:cs="Times New Roman"/>
+                <w:i w:val="false"/>
+                <w:b w:val="false"/>
+                <w:u w:val="none"/>
+                <w:strike w:val="false"/>
+                <w:sz w:val="16"/>
+                <w:szCs w:val="16"/>
+                <w:color w:val="000000"/>
+              </w:rPr>
+            </w:pPr>
+            <w:r>
+              <w:rPr>
+                <w:rFonts w:ascii="Times New Roman" w:hAnsi="Times New Roman" w:eastAsia="Times New Roman" w:cs="Times New Roman"/>
                 <w:i w:val="false"/>
                 <w:b w:val="false"/>
                 <w:u w:val="none"/>
@@ -1368,19 +1368,19 @@
               <w:spacing w:after="60" w:before="60" w:line="240"/>
               <w:ind w:left="60" w:right="60" w:firstLine="0" w:firstLineChars="0"/>
               <w:rPr>
-                <w:rFonts w:ascii="Calibri" w:hAnsi="Calibri" w:eastAsia="Calibri" w:cs="Calibri"/>
-                <w:i w:val="false"/>
-                <w:b w:val="false"/>
-                <w:u w:val="none"/>
-                <w:strike w:val="false"/>
-                <w:sz w:val="16"/>
-                <w:szCs w:val="16"/>
-                <w:color w:val="000000"/>
-              </w:rPr>
-            </w:pPr>
-            <w:r>
-              <w:rPr>
-                <w:rFonts w:ascii="Calibri" w:hAnsi="Calibri" w:eastAsia="Calibri" w:cs="Calibri"/>
+                <w:rFonts w:ascii="Times New Roman" w:hAnsi="Times New Roman" w:eastAsia="Times New Roman" w:cs="Times New Roman"/>
+                <w:i w:val="false"/>
+                <w:b w:val="false"/>
+                <w:u w:val="none"/>
+                <w:strike w:val="false"/>
+                <w:sz w:val="16"/>
+                <w:szCs w:val="16"/>
+                <w:color w:val="000000"/>
+              </w:rPr>
+            </w:pPr>
+            <w:r>
+              <w:rPr>
+                <w:rFonts w:ascii="Times New Roman" w:hAnsi="Times New Roman" w:eastAsia="Times New Roman" w:cs="Times New Roman"/>
                 <w:i w:val="false"/>
                 <w:b w:val="false"/>
                 <w:u w:val="none"/>
@@ -1422,19 +1422,19 @@
               <w:spacing w:after="60" w:before="60" w:line="240"/>
               <w:ind w:left="60" w:right="60" w:firstLine="0" w:firstLineChars="0"/>
               <w:rPr>
-                <w:rFonts w:ascii="Calibri" w:hAnsi="Calibri" w:eastAsia="Calibri" w:cs="Calibri"/>
-                <w:i w:val="false"/>
-                <w:b w:val="false"/>
-                <w:u w:val="none"/>
-                <w:strike w:val="false"/>
-                <w:sz w:val="16"/>
-                <w:szCs w:val="16"/>
-                <w:color w:val="000000"/>
-              </w:rPr>
-            </w:pPr>
-            <w:r>
-              <w:rPr>
-                <w:rFonts w:ascii="Calibri" w:hAnsi="Calibri" w:eastAsia="Calibri" w:cs="Calibri"/>
+                <w:rFonts w:ascii="Times New Roman" w:hAnsi="Times New Roman" w:eastAsia="Times New Roman" w:cs="Times New Roman"/>
+                <w:i w:val="false"/>
+                <w:b w:val="false"/>
+                <w:u w:val="none"/>
+                <w:strike w:val="false"/>
+                <w:sz w:val="16"/>
+                <w:szCs w:val="16"/>
+                <w:color w:val="000000"/>
+              </w:rPr>
+            </w:pPr>
+            <w:r>
+              <w:rPr>
+                <w:rFonts w:ascii="Times New Roman" w:hAnsi="Times New Roman" w:eastAsia="Times New Roman" w:cs="Times New Roman"/>
                 <w:i w:val="false"/>
                 <w:b w:val="false"/>
                 <w:u w:val="none"/>
@@ -1450,7 +1450,7 @@
       </w:tr>
       <w:tr>
         <w:trPr>
-          <w:trHeight w:val="296" w:hRule="auto"/>
+          <w:trHeight w:val="295" w:hRule="auto"/>
         </w:trPr>
         body2
         <w:tc>
@@ -1482,19 +1482,19 @@
               <w:spacing w:after="60" w:before="60" w:line="240"/>
               <w:ind w:left="60" w:right="60" w:firstLine="0" w:firstLineChars="0"/>
               <w:rPr>
-                <w:rFonts w:ascii="Calibri" w:hAnsi="Calibri" w:eastAsia="Calibri" w:cs="Calibri"/>
-                <w:i w:val="false"/>
-                <w:b w:val="false"/>
-                <w:u w:val="none"/>
-                <w:strike w:val="false"/>
-                <w:sz w:val="16"/>
-                <w:szCs w:val="16"/>
-                <w:color w:val="000000"/>
-              </w:rPr>
-            </w:pPr>
-            <w:r>
-              <w:rPr>
-                <w:rFonts w:ascii="Calibri" w:hAnsi="Calibri" w:eastAsia="Calibri" w:cs="Calibri"/>
+                <w:rFonts w:ascii="Times New Roman" w:hAnsi="Times New Roman" w:eastAsia="Times New Roman" w:cs="Times New Roman"/>
+                <w:i w:val="false"/>
+                <w:b w:val="false"/>
+                <w:u w:val="none"/>
+                <w:strike w:val="false"/>
+                <w:sz w:val="16"/>
+                <w:szCs w:val="16"/>
+                <w:color w:val="000000"/>
+              </w:rPr>
+            </w:pPr>
+            <w:r>
+              <w:rPr>
+                <w:rFonts w:ascii="Times New Roman" w:hAnsi="Times New Roman" w:eastAsia="Times New Roman" w:cs="Times New Roman"/>
                 <w:i w:val="false"/>
                 <w:b w:val="false"/>
                 <w:u w:val="none"/>
@@ -1536,19 +1536,19 @@
               <w:spacing w:after="60" w:before="60" w:line="240"/>
               <w:ind w:left="60" w:right="60" w:firstLine="0" w:firstLineChars="0"/>
               <w:rPr>
-                <w:rFonts w:ascii="Calibri" w:hAnsi="Calibri" w:eastAsia="Calibri" w:cs="Calibri"/>
-                <w:i w:val="false"/>
-                <w:b w:val="false"/>
-                <w:u w:val="none"/>
-                <w:strike w:val="false"/>
-                <w:sz w:val="16"/>
-                <w:szCs w:val="16"/>
-                <w:color w:val="000000"/>
-              </w:rPr>
-            </w:pPr>
-            <w:r>
-              <w:rPr>
-                <w:rFonts w:ascii="Calibri" w:hAnsi="Calibri" w:eastAsia="Calibri" w:cs="Calibri"/>
+                <w:rFonts w:ascii="Times New Roman" w:hAnsi="Times New Roman" w:eastAsia="Times New Roman" w:cs="Times New Roman"/>
+                <w:i w:val="false"/>
+                <w:b w:val="false"/>
+                <w:u w:val="none"/>
+                <w:strike w:val="false"/>
+                <w:sz w:val="16"/>
+                <w:szCs w:val="16"/>
+                <w:color w:val="000000"/>
+              </w:rPr>
+            </w:pPr>
+            <w:r>
+              <w:rPr>
+                <w:rFonts w:ascii="Times New Roman" w:hAnsi="Times New Roman" w:eastAsia="Times New Roman" w:cs="Times New Roman"/>
                 <w:i w:val="false"/>
                 <w:b w:val="false"/>
                 <w:u w:val="none"/>
@@ -1590,19 +1590,19 @@
               <w:spacing w:after="60" w:before="60" w:line="240"/>
               <w:ind w:left="60" w:right="60" w:firstLine="0" w:firstLineChars="0"/>
               <w:rPr>
-                <w:rFonts w:ascii="Calibri" w:hAnsi="Calibri" w:eastAsia="Calibri" w:cs="Calibri"/>
-                <w:i w:val="false"/>
-                <w:b w:val="false"/>
-                <w:u w:val="none"/>
-                <w:strike w:val="false"/>
-                <w:sz w:val="16"/>
-                <w:szCs w:val="16"/>
-                <w:color w:val="000000"/>
-              </w:rPr>
-            </w:pPr>
-            <w:r>
-              <w:rPr>
-                <w:rFonts w:ascii="Calibri" w:hAnsi="Calibri" w:eastAsia="Calibri" w:cs="Calibri"/>
+                <w:rFonts w:ascii="Times New Roman" w:hAnsi="Times New Roman" w:eastAsia="Times New Roman" w:cs="Times New Roman"/>
+                <w:i w:val="false"/>
+                <w:b w:val="false"/>
+                <w:u w:val="none"/>
+                <w:strike w:val="false"/>
+                <w:sz w:val="16"/>
+                <w:szCs w:val="16"/>
+                <w:color w:val="000000"/>
+              </w:rPr>
+            </w:pPr>
+            <w:r>
+              <w:rPr>
+                <w:rFonts w:ascii="Times New Roman" w:hAnsi="Times New Roman" w:eastAsia="Times New Roman" w:cs="Times New Roman"/>
                 <w:i w:val="false"/>
                 <w:b w:val="false"/>
                 <w:u w:val="none"/>
@@ -1644,19 +1644,19 @@
               <w:spacing w:after="60" w:before="60" w:line="240"/>
               <w:ind w:left="60" w:right="60" w:firstLine="0" w:firstLineChars="0"/>
               <w:rPr>
-                <w:rFonts w:ascii="Calibri" w:hAnsi="Calibri" w:eastAsia="Calibri" w:cs="Calibri"/>
-                <w:i w:val="false"/>
-                <w:b w:val="false"/>
-                <w:u w:val="none"/>
-                <w:strike w:val="false"/>
-                <w:sz w:val="16"/>
-                <w:szCs w:val="16"/>
-                <w:color w:val="000000"/>
-              </w:rPr>
-            </w:pPr>
-            <w:r>
-              <w:rPr>
-                <w:rFonts w:ascii="Calibri" w:hAnsi="Calibri" w:eastAsia="Calibri" w:cs="Calibri"/>
+                <w:rFonts w:ascii="Times New Roman" w:hAnsi="Times New Roman" w:eastAsia="Times New Roman" w:cs="Times New Roman"/>
+                <w:i w:val="false"/>
+                <w:b w:val="false"/>
+                <w:u w:val="none"/>
+                <w:strike w:val="false"/>
+                <w:sz w:val="16"/>
+                <w:szCs w:val="16"/>
+                <w:color w:val="000000"/>
+              </w:rPr>
+            </w:pPr>
+            <w:r>
+              <w:rPr>
+                <w:rFonts w:ascii="Times New Roman" w:hAnsi="Times New Roman" w:eastAsia="Times New Roman" w:cs="Times New Roman"/>
                 <w:i w:val="false"/>
                 <w:b w:val="false"/>
                 <w:u w:val="none"/>
@@ -1698,19 +1698,19 @@
               <w:spacing w:after="60" w:before="60" w:line="240"/>
               <w:ind w:left="60" w:right="60" w:firstLine="0" w:firstLineChars="0"/>
               <w:rPr>
-                <w:rFonts w:ascii="Calibri" w:hAnsi="Calibri" w:eastAsia="Calibri" w:cs="Calibri"/>
-                <w:i w:val="false"/>
-                <w:b w:val="false"/>
-                <w:u w:val="none"/>
-                <w:strike w:val="false"/>
-                <w:sz w:val="16"/>
-                <w:szCs w:val="16"/>
-                <w:color w:val="000000"/>
-              </w:rPr>
-            </w:pPr>
-            <w:r>
-              <w:rPr>
-                <w:rFonts w:ascii="Calibri" w:hAnsi="Calibri" w:eastAsia="Calibri" w:cs="Calibri"/>
+                <w:rFonts w:ascii="Times New Roman" w:hAnsi="Times New Roman" w:eastAsia="Times New Roman" w:cs="Times New Roman"/>
+                <w:i w:val="false"/>
+                <w:b w:val="false"/>
+                <w:u w:val="none"/>
+                <w:strike w:val="false"/>
+                <w:sz w:val="16"/>
+                <w:szCs w:val="16"/>
+                <w:color w:val="000000"/>
+              </w:rPr>
+            </w:pPr>
+            <w:r>
+              <w:rPr>
+                <w:rFonts w:ascii="Times New Roman" w:hAnsi="Times New Roman" w:eastAsia="Times New Roman" w:cs="Times New Roman"/>
                 <w:i w:val="false"/>
                 <w:b w:val="false"/>
                 <w:u w:val="none"/>
@@ -1752,19 +1752,19 @@
               <w:spacing w:after="60" w:before="60" w:line="240"/>
               <w:ind w:left="60" w:right="60" w:firstLine="0" w:firstLineChars="0"/>
               <w:rPr>
-                <w:rFonts w:ascii="Calibri" w:hAnsi="Calibri" w:eastAsia="Calibri" w:cs="Calibri"/>
-                <w:i w:val="false"/>
-                <w:b w:val="false"/>
-                <w:u w:val="none"/>
-                <w:strike w:val="false"/>
-                <w:sz w:val="16"/>
-                <w:szCs w:val="16"/>
-                <w:color w:val="000000"/>
-              </w:rPr>
-            </w:pPr>
-            <w:r>
-              <w:rPr>
-                <w:rFonts w:ascii="Calibri" w:hAnsi="Calibri" w:eastAsia="Calibri" w:cs="Calibri"/>
+                <w:rFonts w:ascii="Times New Roman" w:hAnsi="Times New Roman" w:eastAsia="Times New Roman" w:cs="Times New Roman"/>
+                <w:i w:val="false"/>
+                <w:b w:val="false"/>
+                <w:u w:val="none"/>
+                <w:strike w:val="false"/>
+                <w:sz w:val="16"/>
+                <w:szCs w:val="16"/>
+                <w:color w:val="000000"/>
+              </w:rPr>
+            </w:pPr>
+            <w:r>
+              <w:rPr>
+                <w:rFonts w:ascii="Times New Roman" w:hAnsi="Times New Roman" w:eastAsia="Times New Roman" w:cs="Times New Roman"/>
                 <w:i w:val="false"/>
                 <w:b w:val="false"/>
                 <w:u w:val="none"/>
@@ -1806,19 +1806,19 @@
               <w:spacing w:after="60" w:before="60" w:line="240"/>
               <w:ind w:left="60" w:right="60" w:firstLine="0" w:firstLineChars="0"/>
               <w:rPr>
-                <w:rFonts w:ascii="Calibri" w:hAnsi="Calibri" w:eastAsia="Calibri" w:cs="Calibri"/>
-                <w:i w:val="false"/>
-                <w:b w:val="false"/>
-                <w:u w:val="none"/>
-                <w:strike w:val="false"/>
-                <w:sz w:val="16"/>
-                <w:szCs w:val="16"/>
-                <w:color w:val="000000"/>
-              </w:rPr>
-            </w:pPr>
-            <w:r>
-              <w:rPr>
-                <w:rFonts w:ascii="Calibri" w:hAnsi="Calibri" w:eastAsia="Calibri" w:cs="Calibri"/>
+                <w:rFonts w:ascii="Times New Roman" w:hAnsi="Times New Roman" w:eastAsia="Times New Roman" w:cs="Times New Roman"/>
+                <w:i w:val="false"/>
+                <w:b w:val="false"/>
+                <w:u w:val="none"/>
+                <w:strike w:val="false"/>
+                <w:sz w:val="16"/>
+                <w:szCs w:val="16"/>
+                <w:color w:val="000000"/>
+              </w:rPr>
+            </w:pPr>
+            <w:r>
+              <w:rPr>
+                <w:rFonts w:ascii="Times New Roman" w:hAnsi="Times New Roman" w:eastAsia="Times New Roman" w:cs="Times New Roman"/>
                 <w:i w:val="false"/>
                 <w:b w:val="false"/>
                 <w:u w:val="none"/>
@@ -1860,19 +1860,19 @@
               <w:spacing w:after="60" w:before="60" w:line="240"/>
               <w:ind w:left="60" w:right="60" w:firstLine="0" w:firstLineChars="0"/>
               <w:rPr>
-                <w:rFonts w:ascii="Calibri" w:hAnsi="Calibri" w:eastAsia="Calibri" w:cs="Calibri"/>
-                <w:i w:val="false"/>
-                <w:b w:val="false"/>
-                <w:u w:val="none"/>
-                <w:strike w:val="false"/>
-                <w:sz w:val="16"/>
-                <w:szCs w:val="16"/>
-                <w:color w:val="000000"/>
-              </w:rPr>
-            </w:pPr>
-            <w:r>
-              <w:rPr>
-                <w:rFonts w:ascii="Calibri" w:hAnsi="Calibri" w:eastAsia="Calibri" w:cs="Calibri"/>
+                <w:rFonts w:ascii="Times New Roman" w:hAnsi="Times New Roman" w:eastAsia="Times New Roman" w:cs="Times New Roman"/>
+                <w:i w:val="false"/>
+                <w:b w:val="false"/>
+                <w:u w:val="none"/>
+                <w:strike w:val="false"/>
+                <w:sz w:val="16"/>
+                <w:szCs w:val="16"/>
+                <w:color w:val="000000"/>
+              </w:rPr>
+            </w:pPr>
+            <w:r>
+              <w:rPr>
+                <w:rFonts w:ascii="Times New Roman" w:hAnsi="Times New Roman" w:eastAsia="Times New Roman" w:cs="Times New Roman"/>
                 <w:i w:val="false"/>
                 <w:b w:val="false"/>
                 <w:u w:val="none"/>
@@ -1914,19 +1914,19 @@
               <w:spacing w:after="60" w:before="60" w:line="240"/>
               <w:ind w:left="60" w:right="60" w:firstLine="0" w:firstLineChars="0"/>
               <w:rPr>
-                <w:rFonts w:ascii="Calibri" w:hAnsi="Calibri" w:eastAsia="Calibri" w:cs="Calibri"/>
-                <w:i w:val="false"/>
-                <w:b w:val="false"/>
-                <w:u w:val="none"/>
-                <w:strike w:val="false"/>
-                <w:sz w:val="16"/>
-                <w:szCs w:val="16"/>
-                <w:color w:val="000000"/>
-              </w:rPr>
-            </w:pPr>
-            <w:r>
-              <w:rPr>
-                <w:rFonts w:ascii="Calibri" w:hAnsi="Calibri" w:eastAsia="Calibri" w:cs="Calibri"/>
+                <w:rFonts w:ascii="Times New Roman" w:hAnsi="Times New Roman" w:eastAsia="Times New Roman" w:cs="Times New Roman"/>
+                <w:i w:val="false"/>
+                <w:b w:val="false"/>
+                <w:u w:val="none"/>
+                <w:strike w:val="false"/>
+                <w:sz w:val="16"/>
+                <w:szCs w:val="16"/>
+                <w:color w:val="000000"/>
+              </w:rPr>
+            </w:pPr>
+            <w:r>
+              <w:rPr>
+                <w:rFonts w:ascii="Times New Roman" w:hAnsi="Times New Roman" w:eastAsia="Times New Roman" w:cs="Times New Roman"/>
                 <w:i w:val="false"/>
                 <w:b w:val="false"/>
                 <w:u w:val="none"/>
@@ -1968,19 +1968,19 @@
               <w:spacing w:after="60" w:before="60" w:line="240"/>
               <w:ind w:left="60" w:right="60" w:firstLine="0" w:firstLineChars="0"/>
               <w:rPr>
-                <w:rFonts w:ascii="Calibri" w:hAnsi="Calibri" w:eastAsia="Calibri" w:cs="Calibri"/>
-                <w:i w:val="false"/>
-                <w:b w:val="false"/>
-                <w:u w:val="none"/>
-                <w:strike w:val="false"/>
-                <w:sz w:val="16"/>
-                <w:szCs w:val="16"/>
-                <w:color w:val="000000"/>
-              </w:rPr>
-            </w:pPr>
-            <w:r>
-              <w:rPr>
-                <w:rFonts w:ascii="Calibri" w:hAnsi="Calibri" w:eastAsia="Calibri" w:cs="Calibri"/>
+                <w:rFonts w:ascii="Times New Roman" w:hAnsi="Times New Roman" w:eastAsia="Times New Roman" w:cs="Times New Roman"/>
+                <w:i w:val="false"/>
+                <w:b w:val="false"/>
+                <w:u w:val="none"/>
+                <w:strike w:val="false"/>
+                <w:sz w:val="16"/>
+                <w:szCs w:val="16"/>
+                <w:color w:val="000000"/>
+              </w:rPr>
+            </w:pPr>
+            <w:r>
+              <w:rPr>
+                <w:rFonts w:ascii="Times New Roman" w:hAnsi="Times New Roman" w:eastAsia="Times New Roman" w:cs="Times New Roman"/>
                 <w:i w:val="false"/>
                 <w:b w:val="false"/>
                 <w:u w:val="none"/>
@@ -2022,19 +2022,19 @@
               <w:spacing w:after="60" w:before="60" w:line="240"/>
               <w:ind w:left="60" w:right="60" w:firstLine="0" w:firstLineChars="0"/>
               <w:rPr>
-                <w:rFonts w:ascii="Calibri" w:hAnsi="Calibri" w:eastAsia="Calibri" w:cs="Calibri"/>
-                <w:i w:val="false"/>
-                <w:b w:val="false"/>
-                <w:u w:val="none"/>
-                <w:strike w:val="false"/>
-                <w:sz w:val="16"/>
-                <w:szCs w:val="16"/>
-                <w:color w:val="000000"/>
-              </w:rPr>
-            </w:pPr>
-            <w:r>
-              <w:rPr>
-                <w:rFonts w:ascii="Calibri" w:hAnsi="Calibri" w:eastAsia="Calibri" w:cs="Calibri"/>
+                <w:rFonts w:ascii="Times New Roman" w:hAnsi="Times New Roman" w:eastAsia="Times New Roman" w:cs="Times New Roman"/>
+                <w:i w:val="false"/>
+                <w:b w:val="false"/>
+                <w:u w:val="none"/>
+                <w:strike w:val="false"/>
+                <w:sz w:val="16"/>
+                <w:szCs w:val="16"/>
+                <w:color w:val="000000"/>
+              </w:rPr>
+            </w:pPr>
+            <w:r>
+              <w:rPr>
+                <w:rFonts w:ascii="Times New Roman" w:hAnsi="Times New Roman" w:eastAsia="Times New Roman" w:cs="Times New Roman"/>
                 <w:i w:val="false"/>
                 <w:b w:val="false"/>
                 <w:u w:val="none"/>
@@ -2076,19 +2076,19 @@
               <w:spacing w:after="60" w:before="60" w:line="240"/>
               <w:ind w:left="60" w:right="60" w:firstLine="0" w:firstLineChars="0"/>
               <w:rPr>
-                <w:rFonts w:ascii="Calibri" w:hAnsi="Calibri" w:eastAsia="Calibri" w:cs="Calibri"/>
-                <w:i w:val="false"/>
-                <w:b w:val="false"/>
-                <w:u w:val="none"/>
-                <w:strike w:val="false"/>
-                <w:sz w:val="16"/>
-                <w:szCs w:val="16"/>
-                <w:color w:val="000000"/>
-              </w:rPr>
-            </w:pPr>
-            <w:r>
-              <w:rPr>
-                <w:rFonts w:ascii="Calibri" w:hAnsi="Calibri" w:eastAsia="Calibri" w:cs="Calibri"/>
+                <w:rFonts w:ascii="Times New Roman" w:hAnsi="Times New Roman" w:eastAsia="Times New Roman" w:cs="Times New Roman"/>
+                <w:i w:val="false"/>
+                <w:b w:val="false"/>
+                <w:u w:val="none"/>
+                <w:strike w:val="false"/>
+                <w:sz w:val="16"/>
+                <w:szCs w:val="16"/>
+                <w:color w:val="000000"/>
+              </w:rPr>
+            </w:pPr>
+            <w:r>
+              <w:rPr>
+                <w:rFonts w:ascii="Times New Roman" w:hAnsi="Times New Roman" w:eastAsia="Times New Roman" w:cs="Times New Roman"/>
                 <w:i w:val="false"/>
                 <w:b w:val="false"/>
                 <w:u w:val="none"/>
@@ -2130,19 +2130,19 @@
               <w:spacing w:after="60" w:before="60" w:line="240"/>
               <w:ind w:left="60" w:right="60" w:firstLine="0" w:firstLineChars="0"/>
               <w:rPr>
-                <w:rFonts w:ascii="Calibri" w:hAnsi="Calibri" w:eastAsia="Calibri" w:cs="Calibri"/>
-                <w:i w:val="false"/>
-                <w:b w:val="false"/>
-                <w:u w:val="none"/>
-                <w:strike w:val="false"/>
-                <w:sz w:val="16"/>
-                <w:szCs w:val="16"/>
-                <w:color w:val="000000"/>
-              </w:rPr>
-            </w:pPr>
-            <w:r>
-              <w:rPr>
-                <w:rFonts w:ascii="Calibri" w:hAnsi="Calibri" w:eastAsia="Calibri" w:cs="Calibri"/>
+                <w:rFonts w:ascii="Times New Roman" w:hAnsi="Times New Roman" w:eastAsia="Times New Roman" w:cs="Times New Roman"/>
+                <w:i w:val="false"/>
+                <w:b w:val="false"/>
+                <w:u w:val="none"/>
+                <w:strike w:val="false"/>
+                <w:sz w:val="16"/>
+                <w:szCs w:val="16"/>
+                <w:color w:val="000000"/>
+              </w:rPr>
+            </w:pPr>
+            <w:r>
+              <w:rPr>
+                <w:rFonts w:ascii="Times New Roman" w:hAnsi="Times New Roman" w:eastAsia="Times New Roman" w:cs="Times New Roman"/>
                 <w:i w:val="false"/>
                 <w:b w:val="false"/>
                 <w:u w:val="none"/>
@@ -2158,7 +2158,7 @@
       </w:tr>
       <w:tr>
         <w:trPr>
-          <w:trHeight w:val="297" w:hRule="auto"/>
+          <w:trHeight w:val="295" w:hRule="auto"/>
         </w:trPr>
         body3
         <w:tc>
@@ -2190,19 +2190,19 @@
               <w:spacing w:after="60" w:before="60" w:line="240"/>
               <w:ind w:left="60" w:right="60" w:firstLine="0" w:firstLineChars="0"/>
               <w:rPr>
-                <w:rFonts w:ascii="Calibri" w:hAnsi="Calibri" w:eastAsia="Calibri" w:cs="Calibri"/>
-                <w:i w:val="false"/>
-                <w:b w:val="false"/>
-                <w:u w:val="none"/>
-                <w:strike w:val="false"/>
-                <w:sz w:val="16"/>
-                <w:szCs w:val="16"/>
-                <w:color w:val="000000"/>
-              </w:rPr>
-            </w:pPr>
-            <w:r>
-              <w:rPr>
-                <w:rFonts w:ascii="Calibri" w:hAnsi="Calibri" w:eastAsia="Calibri" w:cs="Calibri"/>
+                <w:rFonts w:ascii="Times New Roman" w:hAnsi="Times New Roman" w:eastAsia="Times New Roman" w:cs="Times New Roman"/>
+                <w:i w:val="false"/>
+                <w:b w:val="false"/>
+                <w:u w:val="none"/>
+                <w:strike w:val="false"/>
+                <w:sz w:val="16"/>
+                <w:szCs w:val="16"/>
+                <w:color w:val="000000"/>
+              </w:rPr>
+            </w:pPr>
+            <w:r>
+              <w:rPr>
+                <w:rFonts w:ascii="Times New Roman" w:hAnsi="Times New Roman" w:eastAsia="Times New Roman" w:cs="Times New Roman"/>
                 <w:i w:val="false"/>
                 <w:b w:val="false"/>
                 <w:u w:val="none"/>
@@ -2244,19 +2244,19 @@
               <w:spacing w:after="60" w:before="60" w:line="240"/>
               <w:ind w:left="60" w:right="60" w:firstLine="0" w:firstLineChars="0"/>
               <w:rPr>
-                <w:rFonts w:ascii="Calibri" w:hAnsi="Calibri" w:eastAsia="Calibri" w:cs="Calibri"/>
-                <w:i w:val="false"/>
-                <w:b w:val="false"/>
-                <w:u w:val="none"/>
-                <w:strike w:val="false"/>
-                <w:sz w:val="16"/>
-                <w:szCs w:val="16"/>
-                <w:color w:val="000000"/>
-              </w:rPr>
-            </w:pPr>
-            <w:r>
-              <w:rPr>
-                <w:rFonts w:ascii="Calibri" w:hAnsi="Calibri" w:eastAsia="Calibri" w:cs="Calibri"/>
+                <w:rFonts w:ascii="Times New Roman" w:hAnsi="Times New Roman" w:eastAsia="Times New Roman" w:cs="Times New Roman"/>
+                <w:i w:val="false"/>
+                <w:b w:val="false"/>
+                <w:u w:val="none"/>
+                <w:strike w:val="false"/>
+                <w:sz w:val="16"/>
+                <w:szCs w:val="16"/>
+                <w:color w:val="000000"/>
+              </w:rPr>
+            </w:pPr>
+            <w:r>
+              <w:rPr>
+                <w:rFonts w:ascii="Times New Roman" w:hAnsi="Times New Roman" w:eastAsia="Times New Roman" w:cs="Times New Roman"/>
                 <w:i w:val="false"/>
                 <w:b w:val="false"/>
                 <w:u w:val="none"/>
@@ -2298,19 +2298,19 @@
               <w:spacing w:after="60" w:before="60" w:line="240"/>
               <w:ind w:left="60" w:right="60" w:firstLine="0" w:firstLineChars="0"/>
               <w:rPr>
-                <w:rFonts w:ascii="Calibri" w:hAnsi="Calibri" w:eastAsia="Calibri" w:cs="Calibri"/>
-                <w:i w:val="false"/>
-                <w:b w:val="false"/>
-                <w:u w:val="none"/>
-                <w:strike w:val="false"/>
-                <w:sz w:val="16"/>
-                <w:szCs w:val="16"/>
-                <w:color w:val="000000"/>
-              </w:rPr>
-            </w:pPr>
-            <w:r>
-              <w:rPr>
-                <w:rFonts w:ascii="Calibri" w:hAnsi="Calibri" w:eastAsia="Calibri" w:cs="Calibri"/>
+                <w:rFonts w:ascii="Times New Roman" w:hAnsi="Times New Roman" w:eastAsia="Times New Roman" w:cs="Times New Roman"/>
+                <w:i w:val="false"/>
+                <w:b w:val="false"/>
+                <w:u w:val="none"/>
+                <w:strike w:val="false"/>
+                <w:sz w:val="16"/>
+                <w:szCs w:val="16"/>
+                <w:color w:val="000000"/>
+              </w:rPr>
+            </w:pPr>
+            <w:r>
+              <w:rPr>
+                <w:rFonts w:ascii="Times New Roman" w:hAnsi="Times New Roman" w:eastAsia="Times New Roman" w:cs="Times New Roman"/>
                 <w:i w:val="false"/>
                 <w:b w:val="false"/>
                 <w:u w:val="none"/>
@@ -2352,19 +2352,19 @@
               <w:spacing w:after="60" w:before="60" w:line="240"/>
               <w:ind w:left="60" w:right="60" w:firstLine="0" w:firstLineChars="0"/>
               <w:rPr>
-                <w:rFonts w:ascii="Calibri" w:hAnsi="Calibri" w:eastAsia="Calibri" w:cs="Calibri"/>
-                <w:i w:val="false"/>
-                <w:b w:val="false"/>
-                <w:u w:val="none"/>
-                <w:strike w:val="false"/>
-                <w:sz w:val="16"/>
-                <w:szCs w:val="16"/>
-                <w:color w:val="000000"/>
-              </w:rPr>
-            </w:pPr>
-            <w:r>
-              <w:rPr>
-                <w:rFonts w:ascii="Calibri" w:hAnsi="Calibri" w:eastAsia="Calibri" w:cs="Calibri"/>
+                <w:rFonts w:ascii="Times New Roman" w:hAnsi="Times New Roman" w:eastAsia="Times New Roman" w:cs="Times New Roman"/>
+                <w:i w:val="false"/>
+                <w:b w:val="false"/>
+                <w:u w:val="none"/>
+                <w:strike w:val="false"/>
+                <w:sz w:val="16"/>
+                <w:szCs w:val="16"/>
+                <w:color w:val="000000"/>
+              </w:rPr>
+            </w:pPr>
+            <w:r>
+              <w:rPr>
+                <w:rFonts w:ascii="Times New Roman" w:hAnsi="Times New Roman" w:eastAsia="Times New Roman" w:cs="Times New Roman"/>
                 <w:i w:val="false"/>
                 <w:b w:val="false"/>
                 <w:u w:val="none"/>
@@ -2406,19 +2406,19 @@
               <w:spacing w:after="60" w:before="60" w:line="240"/>
               <w:ind w:left="60" w:right="60" w:firstLine="0" w:firstLineChars="0"/>
               <w:rPr>
-                <w:rFonts w:ascii="Calibri" w:hAnsi="Calibri" w:eastAsia="Calibri" w:cs="Calibri"/>
-                <w:i w:val="false"/>
-                <w:b w:val="false"/>
-                <w:u w:val="none"/>
-                <w:strike w:val="false"/>
-                <w:sz w:val="16"/>
-                <w:szCs w:val="16"/>
-                <w:color w:val="000000"/>
-              </w:rPr>
-            </w:pPr>
-            <w:r>
-              <w:rPr>
-                <w:rFonts w:ascii="Calibri" w:hAnsi="Calibri" w:eastAsia="Calibri" w:cs="Calibri"/>
+                <w:rFonts w:ascii="Times New Roman" w:hAnsi="Times New Roman" w:eastAsia="Times New Roman" w:cs="Times New Roman"/>
+                <w:i w:val="false"/>
+                <w:b w:val="false"/>
+                <w:u w:val="none"/>
+                <w:strike w:val="false"/>
+                <w:sz w:val="16"/>
+                <w:szCs w:val="16"/>
+                <w:color w:val="000000"/>
+              </w:rPr>
+            </w:pPr>
+            <w:r>
+              <w:rPr>
+                <w:rFonts w:ascii="Times New Roman" w:hAnsi="Times New Roman" w:eastAsia="Times New Roman" w:cs="Times New Roman"/>
                 <w:i w:val="false"/>
                 <w:b w:val="false"/>
                 <w:u w:val="none"/>
@@ -2460,19 +2460,19 @@
               <w:spacing w:after="60" w:before="60" w:line="240"/>
               <w:ind w:left="60" w:right="60" w:firstLine="0" w:firstLineChars="0"/>
               <w:rPr>
-                <w:rFonts w:ascii="Calibri" w:hAnsi="Calibri" w:eastAsia="Calibri" w:cs="Calibri"/>
-                <w:i w:val="false"/>
-                <w:b w:val="false"/>
-                <w:u w:val="none"/>
-                <w:strike w:val="false"/>
-                <w:sz w:val="16"/>
-                <w:szCs w:val="16"/>
-                <w:color w:val="000000"/>
-              </w:rPr>
-            </w:pPr>
-            <w:r>
-              <w:rPr>
-                <w:rFonts w:ascii="Calibri" w:hAnsi="Calibri" w:eastAsia="Calibri" w:cs="Calibri"/>
+                <w:rFonts w:ascii="Times New Roman" w:hAnsi="Times New Roman" w:eastAsia="Times New Roman" w:cs="Times New Roman"/>
+                <w:i w:val="false"/>
+                <w:b w:val="false"/>
+                <w:u w:val="none"/>
+                <w:strike w:val="false"/>
+                <w:sz w:val="16"/>
+                <w:szCs w:val="16"/>
+                <w:color w:val="000000"/>
+              </w:rPr>
+            </w:pPr>
+            <w:r>
+              <w:rPr>
+                <w:rFonts w:ascii="Times New Roman" w:hAnsi="Times New Roman" w:eastAsia="Times New Roman" w:cs="Times New Roman"/>
                 <w:i w:val="false"/>
                 <w:b w:val="false"/>
                 <w:u w:val="none"/>
@@ -2514,19 +2514,19 @@
               <w:spacing w:after="60" w:before="60" w:line="240"/>
               <w:ind w:left="60" w:right="60" w:firstLine="0" w:firstLineChars="0"/>
               <w:rPr>
-                <w:rFonts w:ascii="Calibri" w:hAnsi="Calibri" w:eastAsia="Calibri" w:cs="Calibri"/>
-                <w:i w:val="false"/>
-                <w:b w:val="false"/>
-                <w:u w:val="none"/>
-                <w:strike w:val="false"/>
-                <w:sz w:val="16"/>
-                <w:szCs w:val="16"/>
-                <w:color w:val="000000"/>
-              </w:rPr>
-            </w:pPr>
-            <w:r>
-              <w:rPr>
-                <w:rFonts w:ascii="Calibri" w:hAnsi="Calibri" w:eastAsia="Calibri" w:cs="Calibri"/>
+                <w:rFonts w:ascii="Times New Roman" w:hAnsi="Times New Roman" w:eastAsia="Times New Roman" w:cs="Times New Roman"/>
+                <w:i w:val="false"/>
+                <w:b w:val="false"/>
+                <w:u w:val="none"/>
+                <w:strike w:val="false"/>
+                <w:sz w:val="16"/>
+                <w:szCs w:val="16"/>
+                <w:color w:val="000000"/>
+              </w:rPr>
+            </w:pPr>
+            <w:r>
+              <w:rPr>
+                <w:rFonts w:ascii="Times New Roman" w:hAnsi="Times New Roman" w:eastAsia="Times New Roman" w:cs="Times New Roman"/>
                 <w:i w:val="false"/>
                 <w:b w:val="false"/>
                 <w:u w:val="none"/>
@@ -2568,19 +2568,19 @@
               <w:spacing w:after="60" w:before="60" w:line="240"/>
               <w:ind w:left="60" w:right="60" w:firstLine="0" w:firstLineChars="0"/>
               <w:rPr>
-                <w:rFonts w:ascii="Calibri" w:hAnsi="Calibri" w:eastAsia="Calibri" w:cs="Calibri"/>
-                <w:i w:val="false"/>
-                <w:b w:val="false"/>
-                <w:u w:val="none"/>
-                <w:strike w:val="false"/>
-                <w:sz w:val="16"/>
-                <w:szCs w:val="16"/>
-                <w:color w:val="000000"/>
-              </w:rPr>
-            </w:pPr>
-            <w:r>
-              <w:rPr>
-                <w:rFonts w:ascii="Calibri" w:hAnsi="Calibri" w:eastAsia="Calibri" w:cs="Calibri"/>
+                <w:rFonts w:ascii="Times New Roman" w:hAnsi="Times New Roman" w:eastAsia="Times New Roman" w:cs="Times New Roman"/>
+                <w:i w:val="false"/>
+                <w:b w:val="false"/>
+                <w:u w:val="none"/>
+                <w:strike w:val="false"/>
+                <w:sz w:val="16"/>
+                <w:szCs w:val="16"/>
+                <w:color w:val="000000"/>
+              </w:rPr>
+            </w:pPr>
+            <w:r>
+              <w:rPr>
+                <w:rFonts w:ascii="Times New Roman" w:hAnsi="Times New Roman" w:eastAsia="Times New Roman" w:cs="Times New Roman"/>
                 <w:i w:val="false"/>
                 <w:b w:val="false"/>
                 <w:u w:val="none"/>
@@ -2622,19 +2622,19 @@
               <w:spacing w:after="60" w:before="60" w:line="240"/>
               <w:ind w:left="60" w:right="60" w:firstLine="0" w:firstLineChars="0"/>
               <w:rPr>
-                <w:rFonts w:ascii="Calibri" w:hAnsi="Calibri" w:eastAsia="Calibri" w:cs="Calibri"/>
-                <w:i w:val="false"/>
-                <w:b w:val="false"/>
-                <w:u w:val="none"/>
-                <w:strike w:val="false"/>
-                <w:sz w:val="16"/>
-                <w:szCs w:val="16"/>
-                <w:color w:val="000000"/>
-              </w:rPr>
-            </w:pPr>
-            <w:r>
-              <w:rPr>
-                <w:rFonts w:ascii="Calibri" w:hAnsi="Calibri" w:eastAsia="Calibri" w:cs="Calibri"/>
+                <w:rFonts w:ascii="Times New Roman" w:hAnsi="Times New Roman" w:eastAsia="Times New Roman" w:cs="Times New Roman"/>
+                <w:i w:val="false"/>
+                <w:b w:val="false"/>
+                <w:u w:val="none"/>
+                <w:strike w:val="false"/>
+                <w:sz w:val="16"/>
+                <w:szCs w:val="16"/>
+                <w:color w:val="000000"/>
+              </w:rPr>
+            </w:pPr>
+            <w:r>
+              <w:rPr>
+                <w:rFonts w:ascii="Times New Roman" w:hAnsi="Times New Roman" w:eastAsia="Times New Roman" w:cs="Times New Roman"/>
                 <w:i w:val="false"/>
                 <w:b w:val="false"/>
                 <w:u w:val="none"/>
@@ -2676,7 +2676,7 @@
               <w:spacing w:after="60" w:before="60" w:line="240"/>
               <w:ind w:left="60" w:right="60" w:firstLine="0" w:firstLineChars="0"/>
               <w:rPr>
-                <w:rFonts w:ascii="Calibri" w:hAnsi="Calibri" w:eastAsia="Calibri" w:cs="Calibri"/>
+                <w:rFonts w:ascii="Times New Roman" w:hAnsi="Times New Roman" w:eastAsia="Times New Roman" w:cs="Times New Roman"/>
                 <w:i w:val="false"/>
                 <w:b w:val="false"/>
                 <w:u w:val="none"/>
@@ -2688,7 +2688,7 @@
             </w:pPr>
             <w:r>
               <w:rPr>
-                <w:rFonts w:ascii="Calibri" w:hAnsi="Calibri" w:eastAsia="Calibri" w:cs="Calibri"/>
+                <w:rFonts w:ascii="Times New Roman" w:hAnsi="Times New Roman" w:eastAsia="Times New Roman" w:cs="Times New Roman"/>
                 <w:i w:val="false"/>
                 <w:b w:val="false"/>
                 <w:u w:val="none"/>
@@ -2730,19 +2730,19 @@
               <w:spacing w:after="60" w:before="60" w:line="240"/>
               <w:ind w:left="60" w:right="60" w:firstLine="0" w:firstLineChars="0"/>
               <w:rPr>
-                <w:rFonts w:ascii="Calibri" w:hAnsi="Calibri" w:eastAsia="Calibri" w:cs="Calibri"/>
-                <w:i w:val="false"/>
-                <w:b w:val="false"/>
-                <w:u w:val="none"/>
-                <w:strike w:val="false"/>
-                <w:sz w:val="16"/>
-                <w:szCs w:val="16"/>
-                <w:color w:val="000000"/>
-              </w:rPr>
-            </w:pPr>
-            <w:r>
-              <w:rPr>
-                <w:rFonts w:ascii="Calibri" w:hAnsi="Calibri" w:eastAsia="Calibri" w:cs="Calibri"/>
+                <w:rFonts w:ascii="Times New Roman" w:hAnsi="Times New Roman" w:eastAsia="Times New Roman" w:cs="Times New Roman"/>
+                <w:i w:val="false"/>
+                <w:b w:val="false"/>
+                <w:u w:val="none"/>
+                <w:strike w:val="false"/>
+                <w:sz w:val="16"/>
+                <w:szCs w:val="16"/>
+                <w:color w:val="000000"/>
+              </w:rPr>
+            </w:pPr>
+            <w:r>
+              <w:rPr>
+                <w:rFonts w:ascii="Times New Roman" w:hAnsi="Times New Roman" w:eastAsia="Times New Roman" w:cs="Times New Roman"/>
                 <w:i w:val="false"/>
                 <w:b w:val="false"/>
                 <w:u w:val="none"/>
@@ -2784,19 +2784,19 @@
               <w:spacing w:after="60" w:before="60" w:line="240"/>
               <w:ind w:left="60" w:right="60" w:firstLine="0" w:firstLineChars="0"/>
               <w:rPr>
-                <w:rFonts w:ascii="Calibri" w:hAnsi="Calibri" w:eastAsia="Calibri" w:cs="Calibri"/>
-                <w:i w:val="false"/>
-                <w:b w:val="false"/>
-                <w:u w:val="none"/>
-                <w:strike w:val="false"/>
-                <w:sz w:val="16"/>
-                <w:szCs w:val="16"/>
-                <w:color w:val="000000"/>
-              </w:rPr>
-            </w:pPr>
-            <w:r>
-              <w:rPr>
-                <w:rFonts w:ascii="Calibri" w:hAnsi="Calibri" w:eastAsia="Calibri" w:cs="Calibri"/>
+                <w:rFonts w:ascii="Times New Roman" w:hAnsi="Times New Roman" w:eastAsia="Times New Roman" w:cs="Times New Roman"/>
+                <w:i w:val="false"/>
+                <w:b w:val="false"/>
+                <w:u w:val="none"/>
+                <w:strike w:val="false"/>
+                <w:sz w:val="16"/>
+                <w:szCs w:val="16"/>
+                <w:color w:val="000000"/>
+              </w:rPr>
+            </w:pPr>
+            <w:r>
+              <w:rPr>
+                <w:rFonts w:ascii="Times New Roman" w:hAnsi="Times New Roman" w:eastAsia="Times New Roman" w:cs="Times New Roman"/>
                 <w:i w:val="false"/>
                 <w:b w:val="false"/>
                 <w:u w:val="none"/>
@@ -2838,7 +2838,7 @@
               <w:spacing w:after="60" w:before="60" w:line="240"/>
               <w:ind w:left="60" w:right="60" w:firstLine="0" w:firstLineChars="0"/>
               <w:rPr>
-                <w:rFonts w:ascii="Calibri" w:hAnsi="Calibri" w:eastAsia="Calibri" w:cs="Calibri"/>
+                <w:rFonts w:ascii="Times New Roman" w:hAnsi="Times New Roman" w:eastAsia="Times New Roman" w:cs="Times New Roman"/>
                 <w:i w:val="false"/>
                 <w:b w:val="true"/>
                 <w:u w:val="none"/>
@@ -2850,7 +2850,7 @@
             </w:pPr>
             <w:r>
               <w:rPr>
-                <w:rFonts w:ascii="Calibri" w:hAnsi="Calibri" w:eastAsia="Calibri" w:cs="Calibri"/>
+                <w:rFonts w:ascii="Times New Roman" w:hAnsi="Times New Roman" w:eastAsia="Times New Roman" w:cs="Times New Roman"/>
                 <w:i w:val="false"/>
                 <w:b w:val="true"/>
                 <w:u w:val="none"/>
@@ -2866,7 +2866,7 @@
       </w:tr>
       <w:tr>
         <w:trPr>
-          <w:trHeight w:val="321" w:hRule="auto"/>
+          <w:trHeight w:val="306" w:hRule="auto"/>
         </w:trPr>
         body4
         <w:tc>
@@ -2898,19 +2898,19 @@
               <w:spacing w:after="60" w:before="60" w:line="240"/>
               <w:ind w:left="60" w:right="60" w:firstLine="0" w:firstLineChars="0"/>
               <w:rPr>
-                <w:rFonts w:ascii="Calibri" w:hAnsi="Calibri" w:eastAsia="Calibri" w:cs="Calibri"/>
-                <w:i w:val="false"/>
-                <w:b w:val="false"/>
-                <w:u w:val="none"/>
-                <w:strike w:val="false"/>
-                <w:sz w:val="16"/>
-                <w:szCs w:val="16"/>
-                <w:color w:val="000000"/>
-              </w:rPr>
-            </w:pPr>
-            <w:r>
-              <w:rPr>
-                <w:rFonts w:ascii="Calibri" w:hAnsi="Calibri" w:eastAsia="Calibri" w:cs="Calibri"/>
+                <w:rFonts w:ascii="Times New Roman" w:hAnsi="Times New Roman" w:eastAsia="Times New Roman" w:cs="Times New Roman"/>
+                <w:i w:val="false"/>
+                <w:b w:val="false"/>
+                <w:u w:val="none"/>
+                <w:strike w:val="false"/>
+                <w:sz w:val="16"/>
+                <w:szCs w:val="16"/>
+                <w:color w:val="000000"/>
+              </w:rPr>
+            </w:pPr>
+            <w:r>
+              <w:rPr>
+                <w:rFonts w:ascii="Times New Roman" w:hAnsi="Times New Roman" w:eastAsia="Times New Roman" w:cs="Times New Roman"/>
                 <w:i w:val="false"/>
                 <w:b w:val="false"/>
                 <w:u w:val="none"/>
@@ -2952,19 +2952,19 @@
               <w:spacing w:after="60" w:before="60" w:line="240"/>
               <w:ind w:left="60" w:right="60" w:firstLine="0" w:firstLineChars="0"/>
               <w:rPr>
-                <w:rFonts w:ascii="Calibri" w:hAnsi="Calibri" w:eastAsia="Calibri" w:cs="Calibri"/>
-                <w:i w:val="false"/>
-                <w:b w:val="false"/>
-                <w:u w:val="none"/>
-                <w:strike w:val="false"/>
-                <w:sz w:val="16"/>
-                <w:szCs w:val="16"/>
-                <w:color w:val="000000"/>
-              </w:rPr>
-            </w:pPr>
-            <w:r>
-              <w:rPr>
-                <w:rFonts w:ascii="Calibri" w:hAnsi="Calibri" w:eastAsia="Calibri" w:cs="Calibri"/>
+                <w:rFonts w:ascii="Times New Roman" w:hAnsi="Times New Roman" w:eastAsia="Times New Roman" w:cs="Times New Roman"/>
+                <w:i w:val="false"/>
+                <w:b w:val="false"/>
+                <w:u w:val="none"/>
+                <w:strike w:val="false"/>
+                <w:sz w:val="16"/>
+                <w:szCs w:val="16"/>
+                <w:color w:val="000000"/>
+              </w:rPr>
+            </w:pPr>
+            <w:r>
+              <w:rPr>
+                <w:rFonts w:ascii="Times New Roman" w:hAnsi="Times New Roman" w:eastAsia="Times New Roman" w:cs="Times New Roman"/>
                 <w:i w:val="false"/>
                 <w:b w:val="false"/>
                 <w:u w:val="none"/>
@@ -3006,19 +3006,19 @@
               <w:spacing w:after="60" w:before="60" w:line="240"/>
               <w:ind w:left="60" w:right="60" w:firstLine="0" w:firstLineChars="0"/>
               <w:rPr>
-                <w:rFonts w:ascii="Calibri" w:hAnsi="Calibri" w:eastAsia="Calibri" w:cs="Calibri"/>
-                <w:i w:val="false"/>
-                <w:b w:val="false"/>
-                <w:u w:val="none"/>
-                <w:strike w:val="false"/>
-                <w:sz w:val="16"/>
-                <w:szCs w:val="16"/>
-                <w:color w:val="000000"/>
-              </w:rPr>
-            </w:pPr>
-            <w:r>
-              <w:rPr>
-                <w:rFonts w:ascii="Calibri" w:hAnsi="Calibri" w:eastAsia="Calibri" w:cs="Calibri"/>
+                <w:rFonts w:ascii="Times New Roman" w:hAnsi="Times New Roman" w:eastAsia="Times New Roman" w:cs="Times New Roman"/>
+                <w:i w:val="false"/>
+                <w:b w:val="false"/>
+                <w:u w:val="none"/>
+                <w:strike w:val="false"/>
+                <w:sz w:val="16"/>
+                <w:szCs w:val="16"/>
+                <w:color w:val="000000"/>
+              </w:rPr>
+            </w:pPr>
+            <w:r>
+              <w:rPr>
+                <w:rFonts w:ascii="Times New Roman" w:hAnsi="Times New Roman" w:eastAsia="Times New Roman" w:cs="Times New Roman"/>
                 <w:i w:val="false"/>
                 <w:b w:val="false"/>
                 <w:u w:val="none"/>
@@ -3060,19 +3060,19 @@
               <w:spacing w:after="60" w:before="60" w:line="240"/>
               <w:ind w:left="60" w:right="60" w:firstLine="0" w:firstLineChars="0"/>
               <w:rPr>
-                <w:rFonts w:ascii="Calibri" w:hAnsi="Calibri" w:eastAsia="Calibri" w:cs="Calibri"/>
-                <w:i w:val="false"/>
-                <w:b w:val="false"/>
-                <w:u w:val="none"/>
-                <w:strike w:val="false"/>
-                <w:sz w:val="16"/>
-                <w:szCs w:val="16"/>
-                <w:color w:val="000000"/>
-              </w:rPr>
-            </w:pPr>
-            <w:r>
-              <w:rPr>
-                <w:rFonts w:ascii="Calibri" w:hAnsi="Calibri" w:eastAsia="Calibri" w:cs="Calibri"/>
+                <w:rFonts w:ascii="Times New Roman" w:hAnsi="Times New Roman" w:eastAsia="Times New Roman" w:cs="Times New Roman"/>
+                <w:i w:val="false"/>
+                <w:b w:val="false"/>
+                <w:u w:val="none"/>
+                <w:strike w:val="false"/>
+                <w:sz w:val="16"/>
+                <w:szCs w:val="16"/>
+                <w:color w:val="000000"/>
+              </w:rPr>
+            </w:pPr>
+            <w:r>
+              <w:rPr>
+                <w:rFonts w:ascii="Times New Roman" w:hAnsi="Times New Roman" w:eastAsia="Times New Roman" w:cs="Times New Roman"/>
                 <w:i w:val="false"/>
                 <w:b w:val="false"/>
                 <w:u w:val="none"/>
@@ -3114,19 +3114,19 @@
               <w:spacing w:after="60" w:before="60" w:line="240"/>
               <w:ind w:left="60" w:right="60" w:firstLine="0" w:firstLineChars="0"/>
               <w:rPr>
-                <w:rFonts w:ascii="Calibri" w:hAnsi="Calibri" w:eastAsia="Calibri" w:cs="Calibri"/>
-                <w:i w:val="false"/>
-                <w:b w:val="false"/>
-                <w:u w:val="none"/>
-                <w:strike w:val="false"/>
-                <w:sz w:val="16"/>
-                <w:szCs w:val="16"/>
-                <w:color w:val="000000"/>
-              </w:rPr>
-            </w:pPr>
-            <w:r>
-              <w:rPr>
-                <w:rFonts w:ascii="Calibri" w:hAnsi="Calibri" w:eastAsia="Calibri" w:cs="Calibri"/>
+                <w:rFonts w:ascii="Times New Roman" w:hAnsi="Times New Roman" w:eastAsia="Times New Roman" w:cs="Times New Roman"/>
+                <w:i w:val="false"/>
+                <w:b w:val="false"/>
+                <w:u w:val="none"/>
+                <w:strike w:val="false"/>
+                <w:sz w:val="16"/>
+                <w:szCs w:val="16"/>
+                <w:color w:val="000000"/>
+              </w:rPr>
+            </w:pPr>
+            <w:r>
+              <w:rPr>
+                <w:rFonts w:ascii="Times New Roman" w:hAnsi="Times New Roman" w:eastAsia="Times New Roman" w:cs="Times New Roman"/>
                 <w:i w:val="false"/>
                 <w:b w:val="false"/>
                 <w:u w:val="none"/>
@@ -3168,19 +3168,19 @@
               <w:spacing w:after="60" w:before="60" w:line="240"/>
               <w:ind w:left="60" w:right="60" w:firstLine="0" w:firstLineChars="0"/>
               <w:rPr>
-                <w:rFonts w:ascii="Calibri" w:hAnsi="Calibri" w:eastAsia="Calibri" w:cs="Calibri"/>
-                <w:i w:val="false"/>
-                <w:b w:val="false"/>
-                <w:u w:val="none"/>
-                <w:strike w:val="false"/>
-                <w:sz w:val="16"/>
-                <w:szCs w:val="16"/>
-                <w:color w:val="000000"/>
-              </w:rPr>
-            </w:pPr>
-            <w:r>
-              <w:rPr>
-                <w:rFonts w:ascii="Calibri" w:hAnsi="Calibri" w:eastAsia="Calibri" w:cs="Calibri"/>
+                <w:rFonts w:ascii="Times New Roman" w:hAnsi="Times New Roman" w:eastAsia="Times New Roman" w:cs="Times New Roman"/>
+                <w:i w:val="false"/>
+                <w:b w:val="false"/>
+                <w:u w:val="none"/>
+                <w:strike w:val="false"/>
+                <w:sz w:val="16"/>
+                <w:szCs w:val="16"/>
+                <w:color w:val="000000"/>
+              </w:rPr>
+            </w:pPr>
+            <w:r>
+              <w:rPr>
+                <w:rFonts w:ascii="Times New Roman" w:hAnsi="Times New Roman" w:eastAsia="Times New Roman" w:cs="Times New Roman"/>
                 <w:i w:val="false"/>
                 <w:b w:val="false"/>
                 <w:u w:val="none"/>
@@ -3222,19 +3222,19 @@
               <w:spacing w:after="60" w:before="60" w:line="240"/>
               <w:ind w:left="60" w:right="60" w:firstLine="0" w:firstLineChars="0"/>
               <w:rPr>
-                <w:rFonts w:ascii="Calibri" w:hAnsi="Calibri" w:eastAsia="Calibri" w:cs="Calibri"/>
-                <w:i w:val="false"/>
-                <w:b w:val="false"/>
-                <w:u w:val="none"/>
-                <w:strike w:val="false"/>
-                <w:sz w:val="16"/>
-                <w:szCs w:val="16"/>
-                <w:color w:val="000000"/>
-              </w:rPr>
-            </w:pPr>
-            <w:r>
-              <w:rPr>
-                <w:rFonts w:ascii="Calibri" w:hAnsi="Calibri" w:eastAsia="Calibri" w:cs="Calibri"/>
+                <w:rFonts w:ascii="Times New Roman" w:hAnsi="Times New Roman" w:eastAsia="Times New Roman" w:cs="Times New Roman"/>
+                <w:i w:val="false"/>
+                <w:b w:val="false"/>
+                <w:u w:val="none"/>
+                <w:strike w:val="false"/>
+                <w:sz w:val="16"/>
+                <w:szCs w:val="16"/>
+                <w:color w:val="000000"/>
+              </w:rPr>
+            </w:pPr>
+            <w:r>
+              <w:rPr>
+                <w:rFonts w:ascii="Times New Roman" w:hAnsi="Times New Roman" w:eastAsia="Times New Roman" w:cs="Times New Roman"/>
                 <w:i w:val="false"/>
                 <w:b w:val="false"/>
                 <w:u w:val="none"/>
@@ -3276,19 +3276,19 @@
               <w:spacing w:after="60" w:before="60" w:line="240"/>
               <w:ind w:left="60" w:right="60" w:firstLine="0" w:firstLineChars="0"/>
               <w:rPr>
-                <w:rFonts w:ascii="Calibri" w:hAnsi="Calibri" w:eastAsia="Calibri" w:cs="Calibri"/>
-                <w:i w:val="false"/>
-                <w:b w:val="false"/>
-                <w:u w:val="none"/>
-                <w:strike w:val="false"/>
-                <w:sz w:val="16"/>
-                <w:szCs w:val="16"/>
-                <w:color w:val="000000"/>
-              </w:rPr>
-            </w:pPr>
-            <w:r>
-              <w:rPr>
-                <w:rFonts w:ascii="Calibri" w:hAnsi="Calibri" w:eastAsia="Calibri" w:cs="Calibri"/>
+                <w:rFonts w:ascii="Times New Roman" w:hAnsi="Times New Roman" w:eastAsia="Times New Roman" w:cs="Times New Roman"/>
+                <w:i w:val="false"/>
+                <w:b w:val="false"/>
+                <w:u w:val="none"/>
+                <w:strike w:val="false"/>
+                <w:sz w:val="16"/>
+                <w:szCs w:val="16"/>
+                <w:color w:val="000000"/>
+              </w:rPr>
+            </w:pPr>
+            <w:r>
+              <w:rPr>
+                <w:rFonts w:ascii="Times New Roman" w:hAnsi="Times New Roman" w:eastAsia="Times New Roman" w:cs="Times New Roman"/>
                 <w:i w:val="false"/>
                 <w:b w:val="false"/>
                 <w:u w:val="none"/>
@@ -3330,19 +3330,19 @@
               <w:spacing w:after="60" w:before="60" w:line="240"/>
               <w:ind w:left="60" w:right="60" w:firstLine="0" w:firstLineChars="0"/>
               <w:rPr>
-                <w:rFonts w:ascii="Calibri" w:hAnsi="Calibri" w:eastAsia="Calibri" w:cs="Calibri"/>
-                <w:i w:val="false"/>
-                <w:b w:val="false"/>
-                <w:u w:val="none"/>
-                <w:strike w:val="false"/>
-                <w:sz w:val="16"/>
-                <w:szCs w:val="16"/>
-                <w:color w:val="000000"/>
-              </w:rPr>
-            </w:pPr>
-            <w:r>
-              <w:rPr>
-                <w:rFonts w:ascii="Calibri" w:hAnsi="Calibri" w:eastAsia="Calibri" w:cs="Calibri"/>
+                <w:rFonts w:ascii="Times New Roman" w:hAnsi="Times New Roman" w:eastAsia="Times New Roman" w:cs="Times New Roman"/>
+                <w:i w:val="false"/>
+                <w:b w:val="false"/>
+                <w:u w:val="none"/>
+                <w:strike w:val="false"/>
+                <w:sz w:val="16"/>
+                <w:szCs w:val="16"/>
+                <w:color w:val="000000"/>
+              </w:rPr>
+            </w:pPr>
+            <w:r>
+              <w:rPr>
+                <w:rFonts w:ascii="Times New Roman" w:hAnsi="Times New Roman" w:eastAsia="Times New Roman" w:cs="Times New Roman"/>
                 <w:i w:val="false"/>
                 <w:b w:val="false"/>
                 <w:u w:val="none"/>
@@ -3384,19 +3384,19 @@
               <w:spacing w:after="60" w:before="60" w:line="240"/>
               <w:ind w:left="60" w:right="60" w:firstLine="0" w:firstLineChars="0"/>
               <w:rPr>
-                <w:rFonts w:ascii="Calibri" w:hAnsi="Calibri" w:eastAsia="Calibri" w:cs="Calibri"/>
-                <w:i w:val="false"/>
-                <w:b w:val="false"/>
-                <w:u w:val="none"/>
-                <w:strike w:val="false"/>
-                <w:sz w:val="16"/>
-                <w:szCs w:val="16"/>
-                <w:color w:val="000000"/>
-              </w:rPr>
-            </w:pPr>
-            <w:r>
-              <w:rPr>
-                <w:rFonts w:ascii="Calibri" w:hAnsi="Calibri" w:eastAsia="Calibri" w:cs="Calibri"/>
+                <w:rFonts w:ascii="Times New Roman" w:hAnsi="Times New Roman" w:eastAsia="Times New Roman" w:cs="Times New Roman"/>
+                <w:i w:val="false"/>
+                <w:b w:val="false"/>
+                <w:u w:val="none"/>
+                <w:strike w:val="false"/>
+                <w:sz w:val="16"/>
+                <w:szCs w:val="16"/>
+                <w:color w:val="000000"/>
+              </w:rPr>
+            </w:pPr>
+            <w:r>
+              <w:rPr>
+                <w:rFonts w:ascii="Times New Roman" w:hAnsi="Times New Roman" w:eastAsia="Times New Roman" w:cs="Times New Roman"/>
                 <w:i w:val="false"/>
                 <w:b w:val="false"/>
                 <w:u w:val="none"/>
@@ -3438,19 +3438,19 @@
               <w:spacing w:after="60" w:before="60" w:line="240"/>
               <w:ind w:left="60" w:right="60" w:firstLine="0" w:firstLineChars="0"/>
               <w:rPr>
-                <w:rFonts w:ascii="Calibri" w:hAnsi="Calibri" w:eastAsia="Calibri" w:cs="Calibri"/>
-                <w:i w:val="false"/>
-                <w:b w:val="false"/>
-                <w:u w:val="none"/>
-                <w:strike w:val="false"/>
-                <w:sz w:val="16"/>
-                <w:szCs w:val="16"/>
-                <w:color w:val="000000"/>
-              </w:rPr>
-            </w:pPr>
-            <w:r>
-              <w:rPr>
-                <w:rFonts w:ascii="Calibri" w:hAnsi="Calibri" w:eastAsia="Calibri" w:cs="Calibri"/>
+                <w:rFonts w:ascii="Times New Roman" w:hAnsi="Times New Roman" w:eastAsia="Times New Roman" w:cs="Times New Roman"/>
+                <w:i w:val="false"/>
+                <w:b w:val="false"/>
+                <w:u w:val="none"/>
+                <w:strike w:val="false"/>
+                <w:sz w:val="16"/>
+                <w:szCs w:val="16"/>
+                <w:color w:val="000000"/>
+              </w:rPr>
+            </w:pPr>
+            <w:r>
+              <w:rPr>
+                <w:rFonts w:ascii="Times New Roman" w:hAnsi="Times New Roman" w:eastAsia="Times New Roman" w:cs="Times New Roman"/>
                 <w:i w:val="false"/>
                 <w:b w:val="false"/>
                 <w:u w:val="none"/>
@@ -3492,19 +3492,19 @@
               <w:spacing w:after="60" w:before="60" w:line="240"/>
               <w:ind w:left="60" w:right="60" w:firstLine="0" w:firstLineChars="0"/>
               <w:rPr>
-                <w:rFonts w:ascii="Calibri" w:hAnsi="Calibri" w:eastAsia="Calibri" w:cs="Calibri"/>
-                <w:i w:val="false"/>
-                <w:b w:val="false"/>
-                <w:u w:val="none"/>
-                <w:strike w:val="false"/>
-                <w:sz w:val="16"/>
-                <w:szCs w:val="16"/>
-                <w:color w:val="000000"/>
-              </w:rPr>
-            </w:pPr>
-            <w:r>
-              <w:rPr>
-                <w:rFonts w:ascii="Calibri" w:hAnsi="Calibri" w:eastAsia="Calibri" w:cs="Calibri"/>
+                <w:rFonts w:ascii="Times New Roman" w:hAnsi="Times New Roman" w:eastAsia="Times New Roman" w:cs="Times New Roman"/>
+                <w:i w:val="false"/>
+                <w:b w:val="false"/>
+                <w:u w:val="none"/>
+                <w:strike w:val="false"/>
+                <w:sz w:val="16"/>
+                <w:szCs w:val="16"/>
+                <w:color w:val="000000"/>
+              </w:rPr>
+            </w:pPr>
+            <w:r>
+              <w:rPr>
+                <w:rFonts w:ascii="Times New Roman" w:hAnsi="Times New Roman" w:eastAsia="Times New Roman" w:cs="Times New Roman"/>
                 <w:i w:val="false"/>
                 <w:b w:val="false"/>
                 <w:u w:val="none"/>
@@ -3546,19 +3546,19 @@
               <w:spacing w:after="60" w:before="60" w:line="240"/>
               <w:ind w:left="60" w:right="60" w:firstLine="0" w:firstLineChars="0"/>
               <w:rPr>
-                <w:rFonts w:ascii="Calibri" w:hAnsi="Calibri" w:eastAsia="Calibri" w:cs="Calibri"/>
-                <w:i w:val="false"/>
-                <w:b w:val="false"/>
-                <w:u w:val="none"/>
-                <w:strike w:val="false"/>
-                <w:sz w:val="16"/>
-                <w:szCs w:val="16"/>
-                <w:color w:val="000000"/>
-              </w:rPr>
-            </w:pPr>
-            <w:r>
-              <w:rPr>
-                <w:rFonts w:ascii="Calibri" w:hAnsi="Calibri" w:eastAsia="Calibri" w:cs="Calibri"/>
+                <w:rFonts w:ascii="Times New Roman" w:hAnsi="Times New Roman" w:eastAsia="Times New Roman" w:cs="Times New Roman"/>
+                <w:i w:val="false"/>
+                <w:b w:val="false"/>
+                <w:u w:val="none"/>
+                <w:strike w:val="false"/>
+                <w:sz w:val="16"/>
+                <w:szCs w:val="16"/>
+                <w:color w:val="000000"/>
+              </w:rPr>
+            </w:pPr>
+            <w:r>
+              <w:rPr>
+                <w:rFonts w:ascii="Times New Roman" w:hAnsi="Times New Roman" w:eastAsia="Times New Roman" w:cs="Times New Roman"/>
                 <w:i w:val="false"/>
                 <w:b w:val="false"/>
                 <w:u w:val="none"/>
@@ -3574,7 +3574,7 @@
       </w:tr>
       <w:tr>
         <w:trPr>
-          <w:trHeight w:val="296" w:hRule="auto"/>
+          <w:trHeight w:val="295" w:hRule="auto"/>
         </w:trPr>
         body5
         <w:tc>
@@ -3606,19 +3606,19 @@
               <w:spacing w:after="60" w:before="60" w:line="240"/>
               <w:ind w:left="60" w:right="60" w:firstLine="0" w:firstLineChars="0"/>
               <w:rPr>
-                <w:rFonts w:ascii="Calibri" w:hAnsi="Calibri" w:eastAsia="Calibri" w:cs="Calibri"/>
-                <w:i w:val="false"/>
-                <w:b w:val="false"/>
-                <w:u w:val="none"/>
-                <w:strike w:val="false"/>
-                <w:sz w:val="16"/>
-                <w:szCs w:val="16"/>
-                <w:color w:val="000000"/>
-              </w:rPr>
-            </w:pPr>
-            <w:r>
-              <w:rPr>
-                <w:rFonts w:ascii="Calibri" w:hAnsi="Calibri" w:eastAsia="Calibri" w:cs="Calibri"/>
+                <w:rFonts w:ascii="Times New Roman" w:hAnsi="Times New Roman" w:eastAsia="Times New Roman" w:cs="Times New Roman"/>
+                <w:i w:val="false"/>
+                <w:b w:val="false"/>
+                <w:u w:val="none"/>
+                <w:strike w:val="false"/>
+                <w:sz w:val="16"/>
+                <w:szCs w:val="16"/>
+                <w:color w:val="000000"/>
+              </w:rPr>
+            </w:pPr>
+            <w:r>
+              <w:rPr>
+                <w:rFonts w:ascii="Times New Roman" w:hAnsi="Times New Roman" w:eastAsia="Times New Roman" w:cs="Times New Roman"/>
                 <w:i w:val="false"/>
                 <w:b w:val="false"/>
                 <w:u w:val="none"/>
@@ -3660,19 +3660,19 @@
               <w:spacing w:after="60" w:before="60" w:line="240"/>
               <w:ind w:left="60" w:right="60" w:firstLine="0" w:firstLineChars="0"/>
               <w:rPr>
-                <w:rFonts w:ascii="Calibri" w:hAnsi="Calibri" w:eastAsia="Calibri" w:cs="Calibri"/>
-                <w:i w:val="false"/>
-                <w:b w:val="false"/>
-                <w:u w:val="none"/>
-                <w:strike w:val="false"/>
-                <w:sz w:val="16"/>
-                <w:szCs w:val="16"/>
-                <w:color w:val="000000"/>
-              </w:rPr>
-            </w:pPr>
-            <w:r>
-              <w:rPr>
-                <w:rFonts w:ascii="Calibri" w:hAnsi="Calibri" w:eastAsia="Calibri" w:cs="Calibri"/>
+                <w:rFonts w:ascii="Times New Roman" w:hAnsi="Times New Roman" w:eastAsia="Times New Roman" w:cs="Times New Roman"/>
+                <w:i w:val="false"/>
+                <w:b w:val="false"/>
+                <w:u w:val="none"/>
+                <w:strike w:val="false"/>
+                <w:sz w:val="16"/>
+                <w:szCs w:val="16"/>
+                <w:color w:val="000000"/>
+              </w:rPr>
+            </w:pPr>
+            <w:r>
+              <w:rPr>
+                <w:rFonts w:ascii="Times New Roman" w:hAnsi="Times New Roman" w:eastAsia="Times New Roman" w:cs="Times New Roman"/>
                 <w:i w:val="false"/>
                 <w:b w:val="false"/>
                 <w:u w:val="none"/>
@@ -3714,19 +3714,19 @@
               <w:spacing w:after="60" w:before="60" w:line="240"/>
               <w:ind w:left="60" w:right="60" w:firstLine="0" w:firstLineChars="0"/>
               <w:rPr>
-                <w:rFonts w:ascii="Calibri" w:hAnsi="Calibri" w:eastAsia="Calibri" w:cs="Calibri"/>
-                <w:i w:val="false"/>
-                <w:b w:val="false"/>
-                <w:u w:val="none"/>
-                <w:strike w:val="false"/>
-                <w:sz w:val="16"/>
-                <w:szCs w:val="16"/>
-                <w:color w:val="000000"/>
-              </w:rPr>
-            </w:pPr>
-            <w:r>
-              <w:rPr>
-                <w:rFonts w:ascii="Calibri" w:hAnsi="Calibri" w:eastAsia="Calibri" w:cs="Calibri"/>
+                <w:rFonts w:ascii="Times New Roman" w:hAnsi="Times New Roman" w:eastAsia="Times New Roman" w:cs="Times New Roman"/>
+                <w:i w:val="false"/>
+                <w:b w:val="false"/>
+                <w:u w:val="none"/>
+                <w:strike w:val="false"/>
+                <w:sz w:val="16"/>
+                <w:szCs w:val="16"/>
+                <w:color w:val="000000"/>
+              </w:rPr>
+            </w:pPr>
+            <w:r>
+              <w:rPr>
+                <w:rFonts w:ascii="Times New Roman" w:hAnsi="Times New Roman" w:eastAsia="Times New Roman" w:cs="Times New Roman"/>
                 <w:i w:val="false"/>
                 <w:b w:val="false"/>
                 <w:u w:val="none"/>
@@ -3768,19 +3768,19 @@
               <w:spacing w:after="60" w:before="60" w:line="240"/>
               <w:ind w:left="60" w:right="60" w:firstLine="0" w:firstLineChars="0"/>
               <w:rPr>
-                <w:rFonts w:ascii="Calibri" w:hAnsi="Calibri" w:eastAsia="Calibri" w:cs="Calibri"/>
-                <w:i w:val="false"/>
-                <w:b w:val="false"/>
-                <w:u w:val="none"/>
-                <w:strike w:val="false"/>
-                <w:sz w:val="16"/>
-                <w:szCs w:val="16"/>
-                <w:color w:val="000000"/>
-              </w:rPr>
-            </w:pPr>
-            <w:r>
-              <w:rPr>
-                <w:rFonts w:ascii="Calibri" w:hAnsi="Calibri" w:eastAsia="Calibri" w:cs="Calibri"/>
+                <w:rFonts w:ascii="Times New Roman" w:hAnsi="Times New Roman" w:eastAsia="Times New Roman" w:cs="Times New Roman"/>
+                <w:i w:val="false"/>
+                <w:b w:val="false"/>
+                <w:u w:val="none"/>
+                <w:strike w:val="false"/>
+                <w:sz w:val="16"/>
+                <w:szCs w:val="16"/>
+                <w:color w:val="000000"/>
+              </w:rPr>
+            </w:pPr>
+            <w:r>
+              <w:rPr>
+                <w:rFonts w:ascii="Times New Roman" w:hAnsi="Times New Roman" w:eastAsia="Times New Roman" w:cs="Times New Roman"/>
                 <w:i w:val="false"/>
                 <w:b w:val="false"/>
                 <w:u w:val="none"/>
@@ -3822,19 +3822,19 @@
               <w:spacing w:after="60" w:before="60" w:line="240"/>
               <w:ind w:left="60" w:right="60" w:firstLine="0" w:firstLineChars="0"/>
               <w:rPr>
-                <w:rFonts w:ascii="Calibri" w:hAnsi="Calibri" w:eastAsia="Calibri" w:cs="Calibri"/>
-                <w:i w:val="false"/>
-                <w:b w:val="false"/>
-                <w:u w:val="none"/>
-                <w:strike w:val="false"/>
-                <w:sz w:val="16"/>
-                <w:szCs w:val="16"/>
-                <w:color w:val="000000"/>
-              </w:rPr>
-            </w:pPr>
-            <w:r>
-              <w:rPr>
-                <w:rFonts w:ascii="Calibri" w:hAnsi="Calibri" w:eastAsia="Calibri" w:cs="Calibri"/>
+                <w:rFonts w:ascii="Times New Roman" w:hAnsi="Times New Roman" w:eastAsia="Times New Roman" w:cs="Times New Roman"/>
+                <w:i w:val="false"/>
+                <w:b w:val="false"/>
+                <w:u w:val="none"/>
+                <w:strike w:val="false"/>
+                <w:sz w:val="16"/>
+                <w:szCs w:val="16"/>
+                <w:color w:val="000000"/>
+              </w:rPr>
+            </w:pPr>
+            <w:r>
+              <w:rPr>
+                <w:rFonts w:ascii="Times New Roman" w:hAnsi="Times New Roman" w:eastAsia="Times New Roman" w:cs="Times New Roman"/>
                 <w:i w:val="false"/>
                 <w:b w:val="false"/>
                 <w:u w:val="none"/>
@@ -3876,19 +3876,19 @@
               <w:spacing w:after="60" w:before="60" w:line="240"/>
               <w:ind w:left="60" w:right="60" w:firstLine="0" w:firstLineChars="0"/>
               <w:rPr>
-                <w:rFonts w:ascii="Calibri" w:hAnsi="Calibri" w:eastAsia="Calibri" w:cs="Calibri"/>
-                <w:i w:val="false"/>
-                <w:b w:val="false"/>
-                <w:u w:val="none"/>
-                <w:strike w:val="false"/>
-                <w:sz w:val="16"/>
-                <w:szCs w:val="16"/>
-                <w:color w:val="000000"/>
-              </w:rPr>
-            </w:pPr>
-            <w:r>
-              <w:rPr>
-                <w:rFonts w:ascii="Calibri" w:hAnsi="Calibri" w:eastAsia="Calibri" w:cs="Calibri"/>
+                <w:rFonts w:ascii="Times New Roman" w:hAnsi="Times New Roman" w:eastAsia="Times New Roman" w:cs="Times New Roman"/>
+                <w:i w:val="false"/>
+                <w:b w:val="false"/>
+                <w:u w:val="none"/>
+                <w:strike w:val="false"/>
+                <w:sz w:val="16"/>
+                <w:szCs w:val="16"/>
+                <w:color w:val="000000"/>
+              </w:rPr>
+            </w:pPr>
+            <w:r>
+              <w:rPr>
+                <w:rFonts w:ascii="Times New Roman" w:hAnsi="Times New Roman" w:eastAsia="Times New Roman" w:cs="Times New Roman"/>
                 <w:i w:val="false"/>
                 <w:b w:val="false"/>
                 <w:u w:val="none"/>
@@ -3930,19 +3930,19 @@
               <w:spacing w:after="60" w:before="60" w:line="240"/>
               <w:ind w:left="60" w:right="60" w:firstLine="0" w:firstLineChars="0"/>
               <w:rPr>
-                <w:rFonts w:ascii="Calibri" w:hAnsi="Calibri" w:eastAsia="Calibri" w:cs="Calibri"/>
-                <w:i w:val="false"/>
-                <w:b w:val="false"/>
-                <w:u w:val="none"/>
-                <w:strike w:val="false"/>
-                <w:sz w:val="16"/>
-                <w:szCs w:val="16"/>
-                <w:color w:val="000000"/>
-              </w:rPr>
-            </w:pPr>
-            <w:r>
-              <w:rPr>
-                <w:rFonts w:ascii="Calibri" w:hAnsi="Calibri" w:eastAsia="Calibri" w:cs="Calibri"/>
+                <w:rFonts w:ascii="Times New Roman" w:hAnsi="Times New Roman" w:eastAsia="Times New Roman" w:cs="Times New Roman"/>
+                <w:i w:val="false"/>
+                <w:b w:val="false"/>
+                <w:u w:val="none"/>
+                <w:strike w:val="false"/>
+                <w:sz w:val="16"/>
+                <w:szCs w:val="16"/>
+                <w:color w:val="000000"/>
+              </w:rPr>
+            </w:pPr>
+            <w:r>
+              <w:rPr>
+                <w:rFonts w:ascii="Times New Roman" w:hAnsi="Times New Roman" w:eastAsia="Times New Roman" w:cs="Times New Roman"/>
                 <w:i w:val="false"/>
                 <w:b w:val="false"/>
                 <w:u w:val="none"/>
@@ -3984,19 +3984,19 @@
               <w:spacing w:after="60" w:before="60" w:line="240"/>
               <w:ind w:left="60" w:right="60" w:firstLine="0" w:firstLineChars="0"/>
               <w:rPr>
-                <w:rFonts w:ascii="Calibri" w:hAnsi="Calibri" w:eastAsia="Calibri" w:cs="Calibri"/>
-                <w:i w:val="false"/>
-                <w:b w:val="false"/>
-                <w:u w:val="none"/>
-                <w:strike w:val="false"/>
-                <w:sz w:val="16"/>
-                <w:szCs w:val="16"/>
-                <w:color w:val="000000"/>
-              </w:rPr>
-            </w:pPr>
-            <w:r>
-              <w:rPr>
-                <w:rFonts w:ascii="Calibri" w:hAnsi="Calibri" w:eastAsia="Calibri" w:cs="Calibri"/>
+                <w:rFonts w:ascii="Times New Roman" w:hAnsi="Times New Roman" w:eastAsia="Times New Roman" w:cs="Times New Roman"/>
+                <w:i w:val="false"/>
+                <w:b w:val="false"/>
+                <w:u w:val="none"/>
+                <w:strike w:val="false"/>
+                <w:sz w:val="16"/>
+                <w:szCs w:val="16"/>
+                <w:color w:val="000000"/>
+              </w:rPr>
+            </w:pPr>
+            <w:r>
+              <w:rPr>
+                <w:rFonts w:ascii="Times New Roman" w:hAnsi="Times New Roman" w:eastAsia="Times New Roman" w:cs="Times New Roman"/>
                 <w:i w:val="false"/>
                 <w:b w:val="false"/>
                 <w:u w:val="none"/>
@@ -4038,19 +4038,19 @@
               <w:spacing w:after="60" w:before="60" w:line="240"/>
               <w:ind w:left="60" w:right="60" w:firstLine="0" w:firstLineChars="0"/>
               <w:rPr>
-                <w:rFonts w:ascii="Calibri" w:hAnsi="Calibri" w:eastAsia="Calibri" w:cs="Calibri"/>
-                <w:i w:val="false"/>
-                <w:b w:val="false"/>
-                <w:u w:val="none"/>
-                <w:strike w:val="false"/>
-                <w:sz w:val="16"/>
-                <w:szCs w:val="16"/>
-                <w:color w:val="000000"/>
-              </w:rPr>
-            </w:pPr>
-            <w:r>
-              <w:rPr>
-                <w:rFonts w:ascii="Calibri" w:hAnsi="Calibri" w:eastAsia="Calibri" w:cs="Calibri"/>
+                <w:rFonts w:ascii="Times New Roman" w:hAnsi="Times New Roman" w:eastAsia="Times New Roman" w:cs="Times New Roman"/>
+                <w:i w:val="false"/>
+                <w:b w:val="false"/>
+                <w:u w:val="none"/>
+                <w:strike w:val="false"/>
+                <w:sz w:val="16"/>
+                <w:szCs w:val="16"/>
+                <w:color w:val="000000"/>
+              </w:rPr>
+            </w:pPr>
+            <w:r>
+              <w:rPr>
+                <w:rFonts w:ascii="Times New Roman" w:hAnsi="Times New Roman" w:eastAsia="Times New Roman" w:cs="Times New Roman"/>
                 <w:i w:val="false"/>
                 <w:b w:val="false"/>
                 <w:u w:val="none"/>
@@ -4092,19 +4092,19 @@
               <w:spacing w:after="60" w:before="60" w:line="240"/>
               <w:ind w:left="60" w:right="60" w:firstLine="0" w:firstLineChars="0"/>
               <w:rPr>
-                <w:rFonts w:ascii="Calibri" w:hAnsi="Calibri" w:eastAsia="Calibri" w:cs="Calibri"/>
-                <w:i w:val="false"/>
-                <w:b w:val="false"/>
-                <w:u w:val="none"/>
-                <w:strike w:val="false"/>
-                <w:sz w:val="16"/>
-                <w:szCs w:val="16"/>
-                <w:color w:val="000000"/>
-              </w:rPr>
-            </w:pPr>
-            <w:r>
-              <w:rPr>
-                <w:rFonts w:ascii="Calibri" w:hAnsi="Calibri" w:eastAsia="Calibri" w:cs="Calibri"/>
+                <w:rFonts w:ascii="Times New Roman" w:hAnsi="Times New Roman" w:eastAsia="Times New Roman" w:cs="Times New Roman"/>
+                <w:i w:val="false"/>
+                <w:b w:val="false"/>
+                <w:u w:val="none"/>
+                <w:strike w:val="false"/>
+                <w:sz w:val="16"/>
+                <w:szCs w:val="16"/>
+                <w:color w:val="000000"/>
+              </w:rPr>
+            </w:pPr>
+            <w:r>
+              <w:rPr>
+                <w:rFonts w:ascii="Times New Roman" w:hAnsi="Times New Roman" w:eastAsia="Times New Roman" w:cs="Times New Roman"/>
                 <w:i w:val="false"/>
                 <w:b w:val="false"/>
                 <w:u w:val="none"/>
@@ -4146,19 +4146,19 @@
               <w:spacing w:after="60" w:before="60" w:line="240"/>
               <w:ind w:left="60" w:right="60" w:firstLine="0" w:firstLineChars="0"/>
               <w:rPr>
-                <w:rFonts w:ascii="Calibri" w:hAnsi="Calibri" w:eastAsia="Calibri" w:cs="Calibri"/>
-                <w:i w:val="false"/>
-                <w:b w:val="false"/>
-                <w:u w:val="none"/>
-                <w:strike w:val="false"/>
-                <w:sz w:val="16"/>
-                <w:szCs w:val="16"/>
-                <w:color w:val="000000"/>
-              </w:rPr>
-            </w:pPr>
-            <w:r>
-              <w:rPr>
-                <w:rFonts w:ascii="Calibri" w:hAnsi="Calibri" w:eastAsia="Calibri" w:cs="Calibri"/>
+                <w:rFonts w:ascii="Times New Roman" w:hAnsi="Times New Roman" w:eastAsia="Times New Roman" w:cs="Times New Roman"/>
+                <w:i w:val="false"/>
+                <w:b w:val="false"/>
+                <w:u w:val="none"/>
+                <w:strike w:val="false"/>
+                <w:sz w:val="16"/>
+                <w:szCs w:val="16"/>
+                <w:color w:val="000000"/>
+              </w:rPr>
+            </w:pPr>
+            <w:r>
+              <w:rPr>
+                <w:rFonts w:ascii="Times New Roman" w:hAnsi="Times New Roman" w:eastAsia="Times New Roman" w:cs="Times New Roman"/>
                 <w:i w:val="false"/>
                 <w:b w:val="false"/>
                 <w:u w:val="none"/>
@@ -4200,19 +4200,19 @@
               <w:spacing w:after="60" w:before="60" w:line="240"/>
               <w:ind w:left="60" w:right="60" w:firstLine="0" w:firstLineChars="0"/>
               <w:rPr>
-                <w:rFonts w:ascii="Calibri" w:hAnsi="Calibri" w:eastAsia="Calibri" w:cs="Calibri"/>
-                <w:i w:val="false"/>
-                <w:b w:val="false"/>
-                <w:u w:val="none"/>
-                <w:strike w:val="false"/>
-                <w:sz w:val="16"/>
-                <w:szCs w:val="16"/>
-                <w:color w:val="000000"/>
-              </w:rPr>
-            </w:pPr>
-            <w:r>
-              <w:rPr>
-                <w:rFonts w:ascii="Calibri" w:hAnsi="Calibri" w:eastAsia="Calibri" w:cs="Calibri"/>
+                <w:rFonts w:ascii="Times New Roman" w:hAnsi="Times New Roman" w:eastAsia="Times New Roman" w:cs="Times New Roman"/>
+                <w:i w:val="false"/>
+                <w:b w:val="false"/>
+                <w:u w:val="none"/>
+                <w:strike w:val="false"/>
+                <w:sz w:val="16"/>
+                <w:szCs w:val="16"/>
+                <w:color w:val="000000"/>
+              </w:rPr>
+            </w:pPr>
+            <w:r>
+              <w:rPr>
+                <w:rFonts w:ascii="Times New Roman" w:hAnsi="Times New Roman" w:eastAsia="Times New Roman" w:cs="Times New Roman"/>
                 <w:i w:val="false"/>
                 <w:b w:val="false"/>
                 <w:u w:val="none"/>
@@ -4254,19 +4254,19 @@
               <w:spacing w:after="60" w:before="60" w:line="240"/>
               <w:ind w:left="60" w:right="60" w:firstLine="0" w:firstLineChars="0"/>
               <w:rPr>
-                <w:rFonts w:ascii="Calibri" w:hAnsi="Calibri" w:eastAsia="Calibri" w:cs="Calibri"/>
-                <w:i w:val="false"/>
-                <w:b w:val="false"/>
-                <w:u w:val="none"/>
-                <w:strike w:val="false"/>
-                <w:sz w:val="16"/>
-                <w:szCs w:val="16"/>
-                <w:color w:val="000000"/>
-              </w:rPr>
-            </w:pPr>
-            <w:r>
-              <w:rPr>
-                <w:rFonts w:ascii="Calibri" w:hAnsi="Calibri" w:eastAsia="Calibri" w:cs="Calibri"/>
+                <w:rFonts w:ascii="Times New Roman" w:hAnsi="Times New Roman" w:eastAsia="Times New Roman" w:cs="Times New Roman"/>
+                <w:i w:val="false"/>
+                <w:b w:val="false"/>
+                <w:u w:val="none"/>
+                <w:strike w:val="false"/>
+                <w:sz w:val="16"/>
+                <w:szCs w:val="16"/>
+                <w:color w:val="000000"/>
+              </w:rPr>
+            </w:pPr>
+            <w:r>
+              <w:rPr>
+                <w:rFonts w:ascii="Times New Roman" w:hAnsi="Times New Roman" w:eastAsia="Times New Roman" w:cs="Times New Roman"/>
                 <w:i w:val="false"/>
                 <w:b w:val="false"/>
                 <w:u w:val="none"/>
@@ -4282,7 +4282,7 @@
       </w:tr>
       <w:tr>
         <w:trPr>
-          <w:trHeight w:val="296" w:hRule="auto"/>
+          <w:trHeight w:val="295" w:hRule="auto"/>
         </w:trPr>
         body6
         <w:tc>
@@ -4314,19 +4314,19 @@
               <w:spacing w:after="60" w:before="60" w:line="240"/>
               <w:ind w:left="60" w:right="60" w:firstLine="0" w:firstLineChars="0"/>
               <w:rPr>
-                <w:rFonts w:ascii="Calibri" w:hAnsi="Calibri" w:eastAsia="Calibri" w:cs="Calibri"/>
-                <w:i w:val="false"/>
-                <w:b w:val="false"/>
-                <w:u w:val="none"/>
-                <w:strike w:val="false"/>
-                <w:sz w:val="16"/>
-                <w:szCs w:val="16"/>
-                <w:color w:val="000000"/>
-              </w:rPr>
-            </w:pPr>
-            <w:r>
-              <w:rPr>
-                <w:rFonts w:ascii="Calibri" w:hAnsi="Calibri" w:eastAsia="Calibri" w:cs="Calibri"/>
+                <w:rFonts w:ascii="Times New Roman" w:hAnsi="Times New Roman" w:eastAsia="Times New Roman" w:cs="Times New Roman"/>
+                <w:i w:val="false"/>
+                <w:b w:val="false"/>
+                <w:u w:val="none"/>
+                <w:strike w:val="false"/>
+                <w:sz w:val="16"/>
+                <w:szCs w:val="16"/>
+                <w:color w:val="000000"/>
+              </w:rPr>
+            </w:pPr>
+            <w:r>
+              <w:rPr>
+                <w:rFonts w:ascii="Times New Roman" w:hAnsi="Times New Roman" w:eastAsia="Times New Roman" w:cs="Times New Roman"/>
                 <w:i w:val="false"/>
                 <w:b w:val="false"/>
                 <w:u w:val="none"/>
@@ -4368,19 +4368,19 @@
               <w:spacing w:after="60" w:before="60" w:line="240"/>
               <w:ind w:left="60" w:right="60" w:firstLine="0" w:firstLineChars="0"/>
               <w:rPr>
-                <w:rFonts w:ascii="Calibri" w:hAnsi="Calibri" w:eastAsia="Calibri" w:cs="Calibri"/>
-                <w:i w:val="false"/>
-                <w:b w:val="false"/>
-                <w:u w:val="none"/>
-                <w:strike w:val="false"/>
-                <w:sz w:val="16"/>
-                <w:szCs w:val="16"/>
-                <w:color w:val="000000"/>
-              </w:rPr>
-            </w:pPr>
-            <w:r>
-              <w:rPr>
-                <w:rFonts w:ascii="Calibri" w:hAnsi="Calibri" w:eastAsia="Calibri" w:cs="Calibri"/>
+                <w:rFonts w:ascii="Times New Roman" w:hAnsi="Times New Roman" w:eastAsia="Times New Roman" w:cs="Times New Roman"/>
+                <w:i w:val="false"/>
+                <w:b w:val="false"/>
+                <w:u w:val="none"/>
+                <w:strike w:val="false"/>
+                <w:sz w:val="16"/>
+                <w:szCs w:val="16"/>
+                <w:color w:val="000000"/>
+              </w:rPr>
+            </w:pPr>
+            <w:r>
+              <w:rPr>
+                <w:rFonts w:ascii="Times New Roman" w:hAnsi="Times New Roman" w:eastAsia="Times New Roman" w:cs="Times New Roman"/>
                 <w:i w:val="false"/>
                 <w:b w:val="false"/>
                 <w:u w:val="none"/>
@@ -4422,19 +4422,19 @@
               <w:spacing w:after="60" w:before="60" w:line="240"/>
               <w:ind w:left="60" w:right="60" w:firstLine="0" w:firstLineChars="0"/>
               <w:rPr>
-                <w:rFonts w:ascii="Calibri" w:hAnsi="Calibri" w:eastAsia="Calibri" w:cs="Calibri"/>
-                <w:i w:val="false"/>
-                <w:b w:val="false"/>
-                <w:u w:val="none"/>
-                <w:strike w:val="false"/>
-                <w:sz w:val="16"/>
-                <w:szCs w:val="16"/>
-                <w:color w:val="000000"/>
-              </w:rPr>
-            </w:pPr>
-            <w:r>
-              <w:rPr>
-                <w:rFonts w:ascii="Calibri" w:hAnsi="Calibri" w:eastAsia="Calibri" w:cs="Calibri"/>
+                <w:rFonts w:ascii="Times New Roman" w:hAnsi="Times New Roman" w:eastAsia="Times New Roman" w:cs="Times New Roman"/>
+                <w:i w:val="false"/>
+                <w:b w:val="false"/>
+                <w:u w:val="none"/>
+                <w:strike w:val="false"/>
+                <w:sz w:val="16"/>
+                <w:szCs w:val="16"/>
+                <w:color w:val="000000"/>
+              </w:rPr>
+            </w:pPr>
+            <w:r>
+              <w:rPr>
+                <w:rFonts w:ascii="Times New Roman" w:hAnsi="Times New Roman" w:eastAsia="Times New Roman" w:cs="Times New Roman"/>
                 <w:i w:val="false"/>
                 <w:b w:val="false"/>
                 <w:u w:val="none"/>
@@ -4476,19 +4476,19 @@
               <w:spacing w:after="60" w:before="60" w:line="240"/>
               <w:ind w:left="60" w:right="60" w:firstLine="0" w:firstLineChars="0"/>
               <w:rPr>
-                <w:rFonts w:ascii="Calibri" w:hAnsi="Calibri" w:eastAsia="Calibri" w:cs="Calibri"/>
-                <w:i w:val="false"/>
-                <w:b w:val="false"/>
-                <w:u w:val="none"/>
-                <w:strike w:val="false"/>
-                <w:sz w:val="16"/>
-                <w:szCs w:val="16"/>
-                <w:color w:val="000000"/>
-              </w:rPr>
-            </w:pPr>
-            <w:r>
-              <w:rPr>
-                <w:rFonts w:ascii="Calibri" w:hAnsi="Calibri" w:eastAsia="Calibri" w:cs="Calibri"/>
+                <w:rFonts w:ascii="Times New Roman" w:hAnsi="Times New Roman" w:eastAsia="Times New Roman" w:cs="Times New Roman"/>
+                <w:i w:val="false"/>
+                <w:b w:val="false"/>
+                <w:u w:val="none"/>
+                <w:strike w:val="false"/>
+                <w:sz w:val="16"/>
+                <w:szCs w:val="16"/>
+                <w:color w:val="000000"/>
+              </w:rPr>
+            </w:pPr>
+            <w:r>
+              <w:rPr>
+                <w:rFonts w:ascii="Times New Roman" w:hAnsi="Times New Roman" w:eastAsia="Times New Roman" w:cs="Times New Roman"/>
                 <w:i w:val="false"/>
                 <w:b w:val="false"/>
                 <w:u w:val="none"/>
@@ -4530,19 +4530,19 @@
               <w:spacing w:after="60" w:before="60" w:line="240"/>
               <w:ind w:left="60" w:right="60" w:firstLine="0" w:firstLineChars="0"/>
               <w:rPr>
-                <w:rFonts w:ascii="Calibri" w:hAnsi="Calibri" w:eastAsia="Calibri" w:cs="Calibri"/>
-                <w:i w:val="false"/>
-                <w:b w:val="false"/>
-                <w:u w:val="none"/>
-                <w:strike w:val="false"/>
-                <w:sz w:val="16"/>
-                <w:szCs w:val="16"/>
-                <w:color w:val="000000"/>
-              </w:rPr>
-            </w:pPr>
-            <w:r>
-              <w:rPr>
-                <w:rFonts w:ascii="Calibri" w:hAnsi="Calibri" w:eastAsia="Calibri" w:cs="Calibri"/>
+                <w:rFonts w:ascii="Times New Roman" w:hAnsi="Times New Roman" w:eastAsia="Times New Roman" w:cs="Times New Roman"/>
+                <w:i w:val="false"/>
+                <w:b w:val="false"/>
+                <w:u w:val="none"/>
+                <w:strike w:val="false"/>
+                <w:sz w:val="16"/>
+                <w:szCs w:val="16"/>
+                <w:color w:val="000000"/>
+              </w:rPr>
+            </w:pPr>
+            <w:r>
+              <w:rPr>
+                <w:rFonts w:ascii="Times New Roman" w:hAnsi="Times New Roman" w:eastAsia="Times New Roman" w:cs="Times New Roman"/>
                 <w:i w:val="false"/>
                 <w:b w:val="false"/>
                 <w:u w:val="none"/>
@@ -4584,19 +4584,19 @@
               <w:spacing w:after="60" w:before="60" w:line="240"/>
               <w:ind w:left="60" w:right="60" w:firstLine="0" w:firstLineChars="0"/>
               <w:rPr>
-                <w:rFonts w:ascii="Calibri" w:hAnsi="Calibri" w:eastAsia="Calibri" w:cs="Calibri"/>
-                <w:i w:val="false"/>
-                <w:b w:val="false"/>
-                <w:u w:val="none"/>
-                <w:strike w:val="false"/>
-                <w:sz w:val="16"/>
-                <w:szCs w:val="16"/>
-                <w:color w:val="000000"/>
-              </w:rPr>
-            </w:pPr>
-            <w:r>
-              <w:rPr>
-                <w:rFonts w:ascii="Calibri" w:hAnsi="Calibri" w:eastAsia="Calibri" w:cs="Calibri"/>
+                <w:rFonts w:ascii="Times New Roman" w:hAnsi="Times New Roman" w:eastAsia="Times New Roman" w:cs="Times New Roman"/>
+                <w:i w:val="false"/>
+                <w:b w:val="false"/>
+                <w:u w:val="none"/>
+                <w:strike w:val="false"/>
+                <w:sz w:val="16"/>
+                <w:szCs w:val="16"/>
+                <w:color w:val="000000"/>
+              </w:rPr>
+            </w:pPr>
+            <w:r>
+              <w:rPr>
+                <w:rFonts w:ascii="Times New Roman" w:hAnsi="Times New Roman" w:eastAsia="Times New Roman" w:cs="Times New Roman"/>
                 <w:i w:val="false"/>
                 <w:b w:val="false"/>
                 <w:u w:val="none"/>
@@ -4638,19 +4638,19 @@
               <w:spacing w:after="60" w:before="60" w:line="240"/>
               <w:ind w:left="60" w:right="60" w:firstLine="0" w:firstLineChars="0"/>
               <w:rPr>
-                <w:rFonts w:ascii="Calibri" w:hAnsi="Calibri" w:eastAsia="Calibri" w:cs="Calibri"/>
-                <w:i w:val="false"/>
-                <w:b w:val="false"/>
-                <w:u w:val="none"/>
-                <w:strike w:val="false"/>
-                <w:sz w:val="16"/>
-                <w:szCs w:val="16"/>
-                <w:color w:val="000000"/>
-              </w:rPr>
-            </w:pPr>
-            <w:r>
-              <w:rPr>
-                <w:rFonts w:ascii="Calibri" w:hAnsi="Calibri" w:eastAsia="Calibri" w:cs="Calibri"/>
+                <w:rFonts w:ascii="Times New Roman" w:hAnsi="Times New Roman" w:eastAsia="Times New Roman" w:cs="Times New Roman"/>
+                <w:i w:val="false"/>
+                <w:b w:val="false"/>
+                <w:u w:val="none"/>
+                <w:strike w:val="false"/>
+                <w:sz w:val="16"/>
+                <w:szCs w:val="16"/>
+                <w:color w:val="000000"/>
+              </w:rPr>
+            </w:pPr>
+            <w:r>
+              <w:rPr>
+                <w:rFonts w:ascii="Times New Roman" w:hAnsi="Times New Roman" w:eastAsia="Times New Roman" w:cs="Times New Roman"/>
                 <w:i w:val="false"/>
                 <w:b w:val="false"/>
                 <w:u w:val="none"/>
@@ -4692,19 +4692,19 @@
               <w:spacing w:after="60" w:before="60" w:line="240"/>
               <w:ind w:left="60" w:right="60" w:firstLine="0" w:firstLineChars="0"/>
               <w:rPr>
-                <w:rFonts w:ascii="Calibri" w:hAnsi="Calibri" w:eastAsia="Calibri" w:cs="Calibri"/>
-                <w:i w:val="false"/>
-                <w:b w:val="false"/>
-                <w:u w:val="none"/>
-                <w:strike w:val="false"/>
-                <w:sz w:val="16"/>
-                <w:szCs w:val="16"/>
-                <w:color w:val="000000"/>
-              </w:rPr>
-            </w:pPr>
-            <w:r>
-              <w:rPr>
-                <w:rFonts w:ascii="Calibri" w:hAnsi="Calibri" w:eastAsia="Calibri" w:cs="Calibri"/>
+                <w:rFonts w:ascii="Times New Roman" w:hAnsi="Times New Roman" w:eastAsia="Times New Roman" w:cs="Times New Roman"/>
+                <w:i w:val="false"/>
+                <w:b w:val="false"/>
+                <w:u w:val="none"/>
+                <w:strike w:val="false"/>
+                <w:sz w:val="16"/>
+                <w:szCs w:val="16"/>
+                <w:color w:val="000000"/>
+              </w:rPr>
+            </w:pPr>
+            <w:r>
+              <w:rPr>
+                <w:rFonts w:ascii="Times New Roman" w:hAnsi="Times New Roman" w:eastAsia="Times New Roman" w:cs="Times New Roman"/>
                 <w:i w:val="false"/>
                 <w:b w:val="false"/>
                 <w:u w:val="none"/>
@@ -4746,19 +4746,19 @@
               <w:spacing w:after="60" w:before="60" w:line="240"/>
               <w:ind w:left="60" w:right="60" w:firstLine="0" w:firstLineChars="0"/>
               <w:rPr>
-                <w:rFonts w:ascii="Calibri" w:hAnsi="Calibri" w:eastAsia="Calibri" w:cs="Calibri"/>
-                <w:i w:val="false"/>
-                <w:b w:val="false"/>
-                <w:u w:val="none"/>
-                <w:strike w:val="false"/>
-                <w:sz w:val="16"/>
-                <w:szCs w:val="16"/>
-                <w:color w:val="000000"/>
-              </w:rPr>
-            </w:pPr>
-            <w:r>
-              <w:rPr>
-                <w:rFonts w:ascii="Calibri" w:hAnsi="Calibri" w:eastAsia="Calibri" w:cs="Calibri"/>
+                <w:rFonts w:ascii="Times New Roman" w:hAnsi="Times New Roman" w:eastAsia="Times New Roman" w:cs="Times New Roman"/>
+                <w:i w:val="false"/>
+                <w:b w:val="false"/>
+                <w:u w:val="none"/>
+                <w:strike w:val="false"/>
+                <w:sz w:val="16"/>
+                <w:szCs w:val="16"/>
+                <w:color w:val="000000"/>
+              </w:rPr>
+            </w:pPr>
+            <w:r>
+              <w:rPr>
+                <w:rFonts w:ascii="Times New Roman" w:hAnsi="Times New Roman" w:eastAsia="Times New Roman" w:cs="Times New Roman"/>
                 <w:i w:val="false"/>
                 <w:b w:val="false"/>
                 <w:u w:val="none"/>
@@ -4800,19 +4800,19 @@
               <w:spacing w:after="60" w:before="60" w:line="240"/>
               <w:ind w:left="60" w:right="60" w:firstLine="0" w:firstLineChars="0"/>
               <w:rPr>
-                <w:rFonts w:ascii="Calibri" w:hAnsi="Calibri" w:eastAsia="Calibri" w:cs="Calibri"/>
-                <w:i w:val="false"/>
-                <w:b w:val="false"/>
-                <w:u w:val="none"/>
-                <w:strike w:val="false"/>
-                <w:sz w:val="16"/>
-                <w:szCs w:val="16"/>
-                <w:color w:val="000000"/>
-              </w:rPr>
-            </w:pPr>
-            <w:r>
-              <w:rPr>
-                <w:rFonts w:ascii="Calibri" w:hAnsi="Calibri" w:eastAsia="Calibri" w:cs="Calibri"/>
+                <w:rFonts w:ascii="Times New Roman" w:hAnsi="Times New Roman" w:eastAsia="Times New Roman" w:cs="Times New Roman"/>
+                <w:i w:val="false"/>
+                <w:b w:val="false"/>
+                <w:u w:val="none"/>
+                <w:strike w:val="false"/>
+                <w:sz w:val="16"/>
+                <w:szCs w:val="16"/>
+                <w:color w:val="000000"/>
+              </w:rPr>
+            </w:pPr>
+            <w:r>
+              <w:rPr>
+                <w:rFonts w:ascii="Times New Roman" w:hAnsi="Times New Roman" w:eastAsia="Times New Roman" w:cs="Times New Roman"/>
                 <w:i w:val="false"/>
                 <w:b w:val="false"/>
                 <w:u w:val="none"/>
@@ -4854,19 +4854,19 @@
               <w:spacing w:after="60" w:before="60" w:line="240"/>
               <w:ind w:left="60" w:right="60" w:firstLine="0" w:firstLineChars="0"/>
               <w:rPr>
-                <w:rFonts w:ascii="Calibri" w:hAnsi="Calibri" w:eastAsia="Calibri" w:cs="Calibri"/>
-                <w:i w:val="false"/>
-                <w:b w:val="false"/>
-                <w:u w:val="none"/>
-                <w:strike w:val="false"/>
-                <w:sz w:val="16"/>
-                <w:szCs w:val="16"/>
-                <w:color w:val="000000"/>
-              </w:rPr>
-            </w:pPr>
-            <w:r>
-              <w:rPr>
-                <w:rFonts w:ascii="Calibri" w:hAnsi="Calibri" w:eastAsia="Calibri" w:cs="Calibri"/>
+                <w:rFonts w:ascii="Times New Roman" w:hAnsi="Times New Roman" w:eastAsia="Times New Roman" w:cs="Times New Roman"/>
+                <w:i w:val="false"/>
+                <w:b w:val="false"/>
+                <w:u w:val="none"/>
+                <w:strike w:val="false"/>
+                <w:sz w:val="16"/>
+                <w:szCs w:val="16"/>
+                <w:color w:val="000000"/>
+              </w:rPr>
+            </w:pPr>
+            <w:r>
+              <w:rPr>
+                <w:rFonts w:ascii="Times New Roman" w:hAnsi="Times New Roman" w:eastAsia="Times New Roman" w:cs="Times New Roman"/>
                 <w:i w:val="false"/>
                 <w:b w:val="false"/>
                 <w:u w:val="none"/>
@@ -4908,19 +4908,19 @@
               <w:spacing w:after="60" w:before="60" w:line="240"/>
               <w:ind w:left="60" w:right="60" w:firstLine="0" w:firstLineChars="0"/>
               <w:rPr>
-                <w:rFonts w:ascii="Calibri" w:hAnsi="Calibri" w:eastAsia="Calibri" w:cs="Calibri"/>
-                <w:i w:val="false"/>
-                <w:b w:val="false"/>
-                <w:u w:val="none"/>
-                <w:strike w:val="false"/>
-                <w:sz w:val="16"/>
-                <w:szCs w:val="16"/>
-                <w:color w:val="000000"/>
-              </w:rPr>
-            </w:pPr>
-            <w:r>
-              <w:rPr>
-                <w:rFonts w:ascii="Calibri" w:hAnsi="Calibri" w:eastAsia="Calibri" w:cs="Calibri"/>
+                <w:rFonts w:ascii="Times New Roman" w:hAnsi="Times New Roman" w:eastAsia="Times New Roman" w:cs="Times New Roman"/>
+                <w:i w:val="false"/>
+                <w:b w:val="false"/>
+                <w:u w:val="none"/>
+                <w:strike w:val="false"/>
+                <w:sz w:val="16"/>
+                <w:szCs w:val="16"/>
+                <w:color w:val="000000"/>
+              </w:rPr>
+            </w:pPr>
+            <w:r>
+              <w:rPr>
+                <w:rFonts w:ascii="Times New Roman" w:hAnsi="Times New Roman" w:eastAsia="Times New Roman" w:cs="Times New Roman"/>
                 <w:i w:val="false"/>
                 <w:b w:val="false"/>
                 <w:u w:val="none"/>
@@ -4962,19 +4962,19 @@
               <w:spacing w:after="60" w:before="60" w:line="240"/>
               <w:ind w:left="60" w:right="60" w:firstLine="0" w:firstLineChars="0"/>
               <w:rPr>
-                <w:rFonts w:ascii="Calibri" w:hAnsi="Calibri" w:eastAsia="Calibri" w:cs="Calibri"/>
-                <w:i w:val="false"/>
-                <w:b w:val="false"/>
-                <w:u w:val="none"/>
-                <w:strike w:val="false"/>
-                <w:sz w:val="16"/>
-                <w:szCs w:val="16"/>
-                <w:color w:val="000000"/>
-              </w:rPr>
-            </w:pPr>
-            <w:r>
-              <w:rPr>
-                <w:rFonts w:ascii="Calibri" w:hAnsi="Calibri" w:eastAsia="Calibri" w:cs="Calibri"/>
+                <w:rFonts w:ascii="Times New Roman" w:hAnsi="Times New Roman" w:eastAsia="Times New Roman" w:cs="Times New Roman"/>
+                <w:i w:val="false"/>
+                <w:b w:val="false"/>
+                <w:u w:val="none"/>
+                <w:strike w:val="false"/>
+                <w:sz w:val="16"/>
+                <w:szCs w:val="16"/>
+                <w:color w:val="000000"/>
+              </w:rPr>
+            </w:pPr>
+            <w:r>
+              <w:rPr>
+                <w:rFonts w:ascii="Times New Roman" w:hAnsi="Times New Roman" w:eastAsia="Times New Roman" w:cs="Times New Roman"/>
                 <w:i w:val="false"/>
                 <w:b w:val="false"/>
                 <w:u w:val="none"/>

</xml_diff>